<commit_message>
Update documents: Story_查询计划展示优化.docx and Story_查询计划缓存优化.docx
git-svn-id: http://192.168.20.11/sequoiadb/trunk@32053 6121f079-4a18-41d3-8c30-8870a322f2c2
</commit_message>
<xml_diff>
--- a/internal_doc/03.开发设计/性能/Story_查询计划缓存优化.docx
+++ b/internal_doc/03.开发设计/性能/Story_查询计划缓存优化.docx
@@ -6517,9 +6517,6 @@
           <w:numId w:val="11"/>
         </w:numPr>
         <w:ind w:firstLineChars="0"/>
-        <w:rPr>
-          <w:rFonts w:hint="eastAsia"/>
-        </w:rPr>
       </w:pPr>
       <w:r>
         <w:rPr>
@@ -12392,7 +12389,26 @@
       </w:r>
     </w:p>
     <w:p/>
-    <w:p/>
+    <w:p>
+      <w:r>
+        <w:rPr>
+          <w:rFonts w:hint="eastAsia"/>
+        </w:rPr>
+        <w:t>例子</w:t>
+      </w:r>
+      <w:r>
+        <w:rPr>
+          <w:rFonts w:hint="eastAsia"/>
+        </w:rPr>
+        <w:t>1</w:t>
+      </w:r>
+      <w:r>
+        <w:rPr>
+          <w:rFonts w:hint="eastAsia"/>
+        </w:rPr>
+        <w:t>：</w:t>
+      </w:r>
+    </w:p>
     <w:tbl>
       <w:tblPr>
         <w:tblStyle w:val="TableGrid"/>
@@ -12864,7 +12880,409 @@
       </w:tr>
     </w:tbl>
     <w:p/>
-    <w:p/>
+    <w:p>
+      <w:pPr>
+        <w:rPr>
+          <w:rFonts w:hint="eastAsia"/>
+        </w:rPr>
+      </w:pPr>
+      <w:r>
+        <w:rPr>
+          <w:rFonts w:hint="eastAsia"/>
+        </w:rPr>
+        <w:t>例子</w:t>
+      </w:r>
+      <w:r>
+        <w:rPr>
+          <w:rFonts w:hint="eastAsia"/>
+        </w:rPr>
+        <w:t>2</w:t>
+      </w:r>
+      <w:r>
+        <w:rPr>
+          <w:rFonts w:hint="eastAsia"/>
+        </w:rPr>
+        <w:t>：</w:t>
+      </w:r>
+    </w:p>
+    <w:p>
+      <w:pPr>
+        <w:pStyle w:val="ListParagraph"/>
+        <w:numPr>
+          <w:ilvl w:val="0"/>
+          <w:numId w:val="47"/>
+        </w:numPr>
+        <w:ind w:firstLineChars="0"/>
+        <w:rPr>
+          <w:rFonts w:hint="eastAsia"/>
+        </w:rPr>
+      </w:pPr>
+      <w:r>
+        <w:rPr>
+          <w:rFonts w:hint="eastAsia"/>
+        </w:rPr>
+        <w:t>第一个查询：</w:t>
+      </w:r>
+      <w:r>
+        <w:rPr>
+          <w:rFonts w:hint="eastAsia"/>
+        </w:rPr>
+        <w:t>{ a : 1, b : 2 }</w:t>
+      </w:r>
+    </w:p>
+    <w:p>
+      <w:pPr>
+        <w:pStyle w:val="ListParagraph"/>
+        <w:numPr>
+          <w:ilvl w:val="1"/>
+          <w:numId w:val="47"/>
+        </w:numPr>
+        <w:ind w:firstLineChars="0"/>
+        <w:rPr>
+          <w:rFonts w:hint="eastAsia"/>
+        </w:rPr>
+      </w:pPr>
+      <w:r>
+        <w:rPr>
+          <w:rFonts w:hint="eastAsia"/>
+        </w:rPr>
+        <w:t>新建参数化的查询计划</w:t>
+      </w:r>
+      <w:r>
+        <w:br/>
+      </w:r>
+      <w:r>
+        <w:rPr>
+          <w:rFonts w:hint="eastAsia"/>
+        </w:rPr>
+        <w:t>{ a : { $et : { $param : xxx } }, b : { $et : { $param : xxx } } }</w:t>
+      </w:r>
+    </w:p>
+    <w:p>
+      <w:pPr>
+        <w:pStyle w:val="ListParagraph"/>
+        <w:numPr>
+          <w:ilvl w:val="1"/>
+          <w:numId w:val="47"/>
+        </w:numPr>
+        <w:ind w:firstLineChars="0"/>
+        <w:rPr>
+          <w:rFonts w:hint="eastAsia"/>
+        </w:rPr>
+      </w:pPr>
+      <w:r>
+        <w:rPr>
+          <w:rFonts w:hint="eastAsia"/>
+        </w:rPr>
+        <w:t>没有生效（</w:t>
+      </w:r>
+      <w:r>
+        <w:rPr>
+          <w:rFonts w:hint="eastAsia"/>
+        </w:rPr>
+        <w:t>5</w:t>
+      </w:r>
+      <w:r>
+        <w:rPr>
+          <w:rFonts w:hint="eastAsia"/>
+        </w:rPr>
+        <w:t>个不同参数使参数化计划有效）</w:t>
+      </w:r>
+    </w:p>
+    <w:p>
+      <w:pPr>
+        <w:pStyle w:val="ListParagraph"/>
+        <w:numPr>
+          <w:ilvl w:val="0"/>
+          <w:numId w:val="47"/>
+        </w:numPr>
+        <w:ind w:firstLineChars="0"/>
+        <w:rPr>
+          <w:rFonts w:hint="eastAsia"/>
+        </w:rPr>
+      </w:pPr>
+      <w:r>
+        <w:rPr>
+          <w:rFonts w:hint="eastAsia"/>
+        </w:rPr>
+        <w:t>第二个查询：</w:t>
+      </w:r>
+      <w:r>
+        <w:rPr>
+          <w:rFonts w:hint="eastAsia"/>
+        </w:rPr>
+        <w:t>{ b : 2, a : 1 }</w:t>
+      </w:r>
+    </w:p>
+    <w:p>
+      <w:pPr>
+        <w:pStyle w:val="ListParagraph"/>
+        <w:numPr>
+          <w:ilvl w:val="1"/>
+          <w:numId w:val="47"/>
+        </w:numPr>
+        <w:ind w:firstLineChars="0"/>
+        <w:rPr>
+          <w:rFonts w:hint="eastAsia"/>
+        </w:rPr>
+      </w:pPr>
+      <w:r>
+        <w:rPr>
+          <w:rFonts w:hint="eastAsia"/>
+        </w:rPr>
+        <w:t>命中相同的参数化计划</w:t>
+      </w:r>
+      <w:r>
+        <w:br/>
+      </w:r>
+      <w:r>
+        <w:rPr>
+          <w:rFonts w:hint="eastAsia"/>
+        </w:rPr>
+        <w:t>{ a : { $et : { $param : xxx } }, b : { $et : { $param : xxx } } }</w:t>
+      </w:r>
+    </w:p>
+    <w:p>
+      <w:pPr>
+        <w:pStyle w:val="ListParagraph"/>
+        <w:numPr>
+          <w:ilvl w:val="1"/>
+          <w:numId w:val="47"/>
+        </w:numPr>
+        <w:ind w:firstLineChars="0"/>
+        <w:rPr>
+          <w:rFonts w:hint="eastAsia"/>
+        </w:rPr>
+      </w:pPr>
+      <w:r>
+        <w:rPr>
+          <w:rFonts w:hint="eastAsia"/>
+        </w:rPr>
+        <w:t>该参数化计划并没有生效</w:t>
+      </w:r>
+    </w:p>
+    <w:p>
+      <w:pPr>
+        <w:pStyle w:val="ListParagraph"/>
+        <w:numPr>
+          <w:ilvl w:val="1"/>
+          <w:numId w:val="47"/>
+        </w:numPr>
+        <w:ind w:firstLineChars="0"/>
+        <w:rPr>
+          <w:rFonts w:hint="eastAsia"/>
+        </w:rPr>
+      </w:pPr>
+      <w:r>
+        <w:rPr>
+          <w:rFonts w:hint="eastAsia"/>
+        </w:rPr>
+        <w:t>查询</w:t>
+      </w:r>
+      <w:r>
+        <w:rPr>
+          <w:rFonts w:hint="eastAsia"/>
+        </w:rPr>
+        <w:t>1</w:t>
+      </w:r>
+      <w:r>
+        <w:rPr>
+          <w:rFonts w:hint="eastAsia"/>
+        </w:rPr>
+        <w:t>和查询</w:t>
+      </w:r>
+      <w:r>
+        <w:rPr>
+          <w:rFonts w:hint="eastAsia"/>
+        </w:rPr>
+        <w:t>2</w:t>
+      </w:r>
+      <w:r>
+        <w:rPr>
+          <w:rFonts w:hint="eastAsia"/>
+        </w:rPr>
+        <w:t>的参数都是</w:t>
+      </w:r>
+      <w:r>
+        <w:rPr>
+          <w:rFonts w:hint="eastAsia"/>
+        </w:rPr>
+        <w:t>[ 1, 2 ]</w:t>
+      </w:r>
+      <w:r>
+        <w:rPr>
+          <w:rFonts w:hint="eastAsia"/>
+        </w:rPr>
+        <w:t>，认为两个查询参数是一致的</w:t>
+      </w:r>
+    </w:p>
+    <w:p>
+      <w:pPr>
+        <w:pStyle w:val="ListParagraph"/>
+        <w:numPr>
+          <w:ilvl w:val="0"/>
+          <w:numId w:val="47"/>
+        </w:numPr>
+        <w:ind w:firstLineChars="0"/>
+        <w:rPr>
+          <w:rFonts w:hint="eastAsia"/>
+        </w:rPr>
+      </w:pPr>
+      <w:r>
+        <w:rPr>
+          <w:rFonts w:hint="eastAsia"/>
+        </w:rPr>
+        <w:t>第三个查询</w:t>
+      </w:r>
+      <w:r>
+        <w:rPr>
+          <w:rFonts w:hint="eastAsia"/>
+        </w:rPr>
+        <w:t>{ b : 3, a : 2 }</w:t>
+      </w:r>
+    </w:p>
+    <w:p>
+      <w:pPr>
+        <w:pStyle w:val="ListParagraph"/>
+        <w:numPr>
+          <w:ilvl w:val="1"/>
+          <w:numId w:val="47"/>
+        </w:numPr>
+        <w:ind w:firstLineChars="0"/>
+        <w:rPr>
+          <w:rFonts w:hint="eastAsia"/>
+        </w:rPr>
+      </w:pPr>
+      <w:r>
+        <w:rPr>
+          <w:rFonts w:hint="eastAsia"/>
+        </w:rPr>
+        <w:t>命中相同的参数化计划</w:t>
+      </w:r>
+      <w:r>
+        <w:br/>
+      </w:r>
+      <w:r>
+        <w:rPr>
+          <w:rFonts w:hint="eastAsia"/>
+        </w:rPr>
+        <w:t>{ a : { $et : { $param : xxx } }, b : { $et : { $param : xxx } } }</w:t>
+      </w:r>
+    </w:p>
+    <w:p>
+      <w:pPr>
+        <w:pStyle w:val="ListParagraph"/>
+        <w:numPr>
+          <w:ilvl w:val="1"/>
+          <w:numId w:val="47"/>
+        </w:numPr>
+        <w:ind w:firstLineChars="0"/>
+        <w:rPr>
+          <w:rFonts w:hint="eastAsia"/>
+        </w:rPr>
+      </w:pPr>
+      <w:r>
+        <w:rPr>
+          <w:rFonts w:hint="eastAsia"/>
+        </w:rPr>
+        <w:t>该参数化计划并没有生效</w:t>
+      </w:r>
+    </w:p>
+    <w:p>
+      <w:pPr>
+        <w:pStyle w:val="ListParagraph"/>
+        <w:numPr>
+          <w:ilvl w:val="1"/>
+          <w:numId w:val="47"/>
+        </w:numPr>
+        <w:ind w:firstLineChars="0"/>
+        <w:rPr>
+          <w:rFonts w:hint="eastAsia"/>
+        </w:rPr>
+      </w:pPr>
+      <w:r>
+        <w:rPr>
+          <w:rFonts w:hint="eastAsia"/>
+        </w:rPr>
+        <w:t>查询</w:t>
+      </w:r>
+      <w:r>
+        <w:rPr>
+          <w:rFonts w:hint="eastAsia"/>
+        </w:rPr>
+        <w:t>1</w:t>
+      </w:r>
+      <w:r>
+        <w:rPr>
+          <w:rFonts w:hint="eastAsia"/>
+        </w:rPr>
+        <w:t>和查询</w:t>
+      </w:r>
+      <w:r>
+        <w:rPr>
+          <w:rFonts w:hint="eastAsia"/>
+        </w:rPr>
+        <w:t>3</w:t>
+      </w:r>
+      <w:r>
+        <w:rPr>
+          <w:rFonts w:hint="eastAsia"/>
+        </w:rPr>
+        <w:t>的参数不一样</w:t>
+      </w:r>
+      <w:r>
+        <w:rPr>
+          <w:rFonts w:hint="eastAsia"/>
+        </w:rPr>
+        <w:t>[ 1, 2 ]</w:t>
+      </w:r>
+      <w:r>
+        <w:rPr>
+          <w:rFonts w:hint="eastAsia"/>
+        </w:rPr>
+        <w:t>和</w:t>
+      </w:r>
+      <w:r>
+        <w:rPr>
+          <w:rFonts w:hint="eastAsia"/>
+        </w:rPr>
+        <w:t>[ 2, 3 ]</w:t>
+      </w:r>
+      <w:r>
+        <w:rPr>
+          <w:rFonts w:hint="eastAsia"/>
+        </w:rPr>
+        <w:t>，因此认为参数是不一致</w:t>
+      </w:r>
+    </w:p>
+    <w:p>
+      <w:pPr>
+        <w:pStyle w:val="ListParagraph"/>
+        <w:numPr>
+          <w:ilvl w:val="1"/>
+          <w:numId w:val="47"/>
+        </w:numPr>
+        <w:ind w:firstLineChars="0"/>
+      </w:pPr>
+      <w:r>
+        <w:rPr>
+          <w:rFonts w:hint="eastAsia"/>
+        </w:rPr>
+        <w:t>需要为查询</w:t>
+      </w:r>
+      <w:r>
+        <w:rPr>
+          <w:rFonts w:hint="eastAsia"/>
+        </w:rPr>
+        <w:t>3</w:t>
+      </w:r>
+      <w:r>
+        <w:rPr>
+          <w:rFonts w:hint="eastAsia"/>
+        </w:rPr>
+        <w:t>重新生成查询计划，用于判断参数化计划是否最终可以生效</w:t>
+      </w:r>
+    </w:p>
     <w:p>
       <w:pPr>
         <w:pStyle w:val="Heading4"/>
@@ -12873,6 +13291,7 @@
         <w:rPr>
           <w:rFonts w:hint="eastAsia"/>
         </w:rPr>
+        <w:lastRenderedPageBreak/>
         <w:t>主子表共享查询计划流程</w:t>
       </w:r>
     </w:p>
@@ -13219,14 +13638,7 @@
         <w:rPr>
           <w:rFonts w:hint="eastAsia"/>
         </w:rPr>
-        <w:t>查询计划</w:t>
-      </w:r>
-      <w:r>
-        <w:rPr>
-          <w:rFonts w:hint="eastAsia"/>
-        </w:rPr>
-        <w:lastRenderedPageBreak/>
-        <w:t>计数加</w:t>
+        <w:t>查询计划计数加</w:t>
       </w:r>
       <w:r>
         <w:rPr>
@@ -13453,6 +13865,7 @@
         <w:rPr>
           <w:rFonts w:hint="eastAsia"/>
         </w:rPr>
+        <w:lastRenderedPageBreak/>
         <w:t>性能统计</w:t>
       </w:r>
     </w:p>
@@ -15159,7 +15572,6 @@
           <w:rFonts w:hint="eastAsia"/>
           <w:noProof/>
         </w:rPr>
-        <w:lastRenderedPageBreak/>
         <w:drawing>
           <wp:inline distT="0" distB="0" distL="0" distR="0">
             <wp:extent cx="4745686" cy="2768906"/>
@@ -15258,6 +15670,7 @@
                 <w:sz w:val="13"/>
                 <w:szCs w:val="13"/>
               </w:rPr>
+              <w:lastRenderedPageBreak/>
               <w:t>线程数</w:t>
             </w:r>
           </w:p>
@@ -16718,7 +17131,6 @@
         <w:rPr>
           <w:rFonts w:hint="eastAsia"/>
         </w:rPr>
-        <w:lastRenderedPageBreak/>
         <w:t>主子表带数据查询</w:t>
       </w:r>
     </w:p>
@@ -18266,6 +18678,7 @@
           <w:rFonts w:hint="eastAsia"/>
           <w:noProof/>
         </w:rPr>
+        <w:lastRenderedPageBreak/>
         <w:drawing>
           <wp:inline distT="0" distB="0" distL="0" distR="0">
             <wp:extent cx="4795150" cy="2798284"/>
@@ -19603,6 +20016,7 @@
         <w:rPr>
           <w:rFonts w:hint="eastAsia"/>
         </w:rPr>
+        <w:lastRenderedPageBreak/>
         <w:t>各级</w:t>
       </w:r>
       <w:r>
@@ -20963,7 +21377,6 @@
         <w:rPr>
           <w:noProof/>
         </w:rPr>
-        <w:lastRenderedPageBreak/>
         <w:drawing>
           <wp:inline distT="0" distB="0" distL="0" distR="0">
             <wp:extent cx="5274310" cy="3076575"/>
@@ -21173,6 +21586,7 @@
         <w:rPr>
           <w:rFonts w:hint="eastAsia"/>
         </w:rPr>
+        <w:lastRenderedPageBreak/>
         <w:t>OPT_PLAN_NORMALIZED</w:t>
       </w:r>
       <w:r>
@@ -22117,7 +22531,6 @@
                 <w:sz w:val="13"/>
                 <w:szCs w:val="13"/>
               </w:rPr>
-              <w:lastRenderedPageBreak/>
               <w:t>OPT_PLAN_ORIGINAL</w:t>
             </w:r>
           </w:p>
@@ -22867,6 +23280,7 @@
         <w:rPr>
           <w:rFonts w:hint="eastAsia"/>
         </w:rPr>
+        <w:lastRenderedPageBreak/>
         <w:t>进度评估跟踪</w:t>
       </w:r>
     </w:p>
@@ -23683,7 +24097,6 @@
         <w:rPr>
           <w:rFonts w:hint="eastAsia"/>
         </w:rPr>
-        <w:lastRenderedPageBreak/>
         <w:t>验收</w:t>
       </w:r>
       <w:r>
@@ -24586,6 +24999,7 @@
               <w:rPr>
                 <w:rFonts w:hint="eastAsia"/>
               </w:rPr>
+              <w:lastRenderedPageBreak/>
               <w:t>验收用例是否全部通过</w:t>
             </w:r>
           </w:p>
@@ -27127,6 +27541,92 @@
     </w:lvl>
   </w:abstractNum>
   <w:abstractNum w:abstractNumId="26">
+    <w:nsid w:val="4B0670DF"/>
+    <w:multiLevelType w:val="hybridMultilevel"/>
+    <w:tmpl w:val="FFEA8316"/>
+    <w:lvl w:ilvl="0" w:tplc="0409000F">
+      <w:start w:val="1"/>
+      <w:numFmt w:val="decimal"/>
+      <w:lvlText w:val="%1."/>
+      <w:lvlJc w:val="left"/>
+      <w:pPr>
+        <w:ind w:left="777" w:hanging="420"/>
+      </w:pPr>
+    </w:lvl>
+    <w:lvl w:ilvl="1" w:tplc="0409000F">
+      <w:start w:val="1"/>
+      <w:numFmt w:val="decimal"/>
+      <w:lvlText w:val="%2."/>
+      <w:lvlJc w:val="left"/>
+      <w:pPr>
+        <w:ind w:left="1197" w:hanging="420"/>
+      </w:pPr>
+    </w:lvl>
+    <w:lvl w:ilvl="2" w:tplc="0409001B" w:tentative="1">
+      <w:start w:val="1"/>
+      <w:numFmt w:val="lowerRoman"/>
+      <w:lvlText w:val="%3."/>
+      <w:lvlJc w:val="right"/>
+      <w:pPr>
+        <w:ind w:left="1617" w:hanging="420"/>
+      </w:pPr>
+    </w:lvl>
+    <w:lvl w:ilvl="3" w:tplc="0409000F" w:tentative="1">
+      <w:start w:val="1"/>
+      <w:numFmt w:val="decimal"/>
+      <w:lvlText w:val="%4."/>
+      <w:lvlJc w:val="left"/>
+      <w:pPr>
+        <w:ind w:left="2037" w:hanging="420"/>
+      </w:pPr>
+    </w:lvl>
+    <w:lvl w:ilvl="4" w:tplc="04090019" w:tentative="1">
+      <w:start w:val="1"/>
+      <w:numFmt w:val="lowerLetter"/>
+      <w:lvlText w:val="%5)"/>
+      <w:lvlJc w:val="left"/>
+      <w:pPr>
+        <w:ind w:left="2457" w:hanging="420"/>
+      </w:pPr>
+    </w:lvl>
+    <w:lvl w:ilvl="5" w:tplc="0409001B" w:tentative="1">
+      <w:start w:val="1"/>
+      <w:numFmt w:val="lowerRoman"/>
+      <w:lvlText w:val="%6."/>
+      <w:lvlJc w:val="right"/>
+      <w:pPr>
+        <w:ind w:left="2877" w:hanging="420"/>
+      </w:pPr>
+    </w:lvl>
+    <w:lvl w:ilvl="6" w:tplc="0409000F" w:tentative="1">
+      <w:start w:val="1"/>
+      <w:numFmt w:val="decimal"/>
+      <w:lvlText w:val="%7."/>
+      <w:lvlJc w:val="left"/>
+      <w:pPr>
+        <w:ind w:left="3297" w:hanging="420"/>
+      </w:pPr>
+    </w:lvl>
+    <w:lvl w:ilvl="7" w:tplc="04090019" w:tentative="1">
+      <w:start w:val="1"/>
+      <w:numFmt w:val="lowerLetter"/>
+      <w:lvlText w:val="%8)"/>
+      <w:lvlJc w:val="left"/>
+      <w:pPr>
+        <w:ind w:left="3717" w:hanging="420"/>
+      </w:pPr>
+    </w:lvl>
+    <w:lvl w:ilvl="8" w:tplc="0409001B" w:tentative="1">
+      <w:start w:val="1"/>
+      <w:numFmt w:val="lowerRoman"/>
+      <w:lvlText w:val="%9."/>
+      <w:lvlJc w:val="right"/>
+      <w:pPr>
+        <w:ind w:left="4137" w:hanging="420"/>
+      </w:pPr>
+    </w:lvl>
+  </w:abstractNum>
+  <w:abstractNum w:abstractNumId="27">
     <w:nsid w:val="506E6442"/>
     <w:multiLevelType w:val="hybridMultilevel"/>
     <w:tmpl w:val="338C01A6"/>
@@ -27212,7 +27712,7 @@
       </w:pPr>
     </w:lvl>
   </w:abstractNum>
-  <w:abstractNum w:abstractNumId="27">
+  <w:abstractNum w:abstractNumId="28">
     <w:nsid w:val="563D1912"/>
     <w:multiLevelType w:val="hybridMultilevel"/>
     <w:tmpl w:val="62BC5BA2"/>
@@ -27298,7 +27798,7 @@
       </w:pPr>
     </w:lvl>
   </w:abstractNum>
-  <w:abstractNum w:abstractNumId="28">
+  <w:abstractNum w:abstractNumId="29">
     <w:nsid w:val="5765029B"/>
     <w:multiLevelType w:val="hybridMultilevel"/>
     <w:tmpl w:val="31B6A236"/>
@@ -27384,7 +27884,7 @@
       </w:pPr>
     </w:lvl>
   </w:abstractNum>
-  <w:abstractNum w:abstractNumId="29">
+  <w:abstractNum w:abstractNumId="30">
     <w:nsid w:val="589E00D2"/>
     <w:multiLevelType w:val="hybridMultilevel"/>
     <w:tmpl w:val="F1EE0268"/>
@@ -27471,7 +27971,7 @@
       </w:pPr>
     </w:lvl>
   </w:abstractNum>
-  <w:abstractNum w:abstractNumId="30">
+  <w:abstractNum w:abstractNumId="31">
     <w:nsid w:val="5B71554B"/>
     <w:multiLevelType w:val="hybridMultilevel"/>
     <w:tmpl w:val="FC701336"/>
@@ -27557,7 +28057,7 @@
       </w:pPr>
     </w:lvl>
   </w:abstractNum>
-  <w:abstractNum w:abstractNumId="31">
+  <w:abstractNum w:abstractNumId="32">
     <w:nsid w:val="5D1D7060"/>
     <w:multiLevelType w:val="hybridMultilevel"/>
     <w:tmpl w:val="542C8574"/>
@@ -27643,7 +28143,7 @@
       </w:pPr>
     </w:lvl>
   </w:abstractNum>
-  <w:abstractNum w:abstractNumId="32">
+  <w:abstractNum w:abstractNumId="33">
     <w:nsid w:val="6250520F"/>
     <w:multiLevelType w:val="hybridMultilevel"/>
     <w:tmpl w:val="723E4382"/>
@@ -27729,7 +28229,7 @@
       </w:pPr>
     </w:lvl>
   </w:abstractNum>
-  <w:abstractNum w:abstractNumId="33">
+  <w:abstractNum w:abstractNumId="34">
     <w:nsid w:val="653C0A41"/>
     <w:multiLevelType w:val="hybridMultilevel"/>
     <w:tmpl w:val="3484237A"/>
@@ -27815,7 +28315,7 @@
       </w:pPr>
     </w:lvl>
   </w:abstractNum>
-  <w:abstractNum w:abstractNumId="34">
+  <w:abstractNum w:abstractNumId="35">
     <w:nsid w:val="69535C3A"/>
     <w:multiLevelType w:val="hybridMultilevel"/>
     <w:tmpl w:val="542C8574"/>
@@ -27901,7 +28401,7 @@
       </w:pPr>
     </w:lvl>
   </w:abstractNum>
-  <w:abstractNum w:abstractNumId="35">
+  <w:abstractNum w:abstractNumId="36">
     <w:nsid w:val="73596A6D"/>
     <w:multiLevelType w:val="hybridMultilevel"/>
     <w:tmpl w:val="542C8574"/>
@@ -27987,7 +28487,93 @@
       </w:pPr>
     </w:lvl>
   </w:abstractNum>
-  <w:abstractNum w:abstractNumId="36">
+  <w:abstractNum w:abstractNumId="37">
+    <w:nsid w:val="75DF4032"/>
+    <w:multiLevelType w:val="hybridMultilevel"/>
+    <w:tmpl w:val="172A2470"/>
+    <w:lvl w:ilvl="0" w:tplc="0409000F">
+      <w:start w:val="1"/>
+      <w:numFmt w:val="decimal"/>
+      <w:lvlText w:val="%1."/>
+      <w:lvlJc w:val="left"/>
+      <w:pPr>
+        <w:ind w:left="777" w:hanging="420"/>
+      </w:pPr>
+    </w:lvl>
+    <w:lvl w:ilvl="1" w:tplc="04090019" w:tentative="1">
+      <w:start w:val="1"/>
+      <w:numFmt w:val="lowerLetter"/>
+      <w:lvlText w:val="%2)"/>
+      <w:lvlJc w:val="left"/>
+      <w:pPr>
+        <w:ind w:left="1197" w:hanging="420"/>
+      </w:pPr>
+    </w:lvl>
+    <w:lvl w:ilvl="2" w:tplc="0409001B" w:tentative="1">
+      <w:start w:val="1"/>
+      <w:numFmt w:val="lowerRoman"/>
+      <w:lvlText w:val="%3."/>
+      <w:lvlJc w:val="right"/>
+      <w:pPr>
+        <w:ind w:left="1617" w:hanging="420"/>
+      </w:pPr>
+    </w:lvl>
+    <w:lvl w:ilvl="3" w:tplc="0409000F" w:tentative="1">
+      <w:start w:val="1"/>
+      <w:numFmt w:val="decimal"/>
+      <w:lvlText w:val="%4."/>
+      <w:lvlJc w:val="left"/>
+      <w:pPr>
+        <w:ind w:left="2037" w:hanging="420"/>
+      </w:pPr>
+    </w:lvl>
+    <w:lvl w:ilvl="4" w:tplc="04090019" w:tentative="1">
+      <w:start w:val="1"/>
+      <w:numFmt w:val="lowerLetter"/>
+      <w:lvlText w:val="%5)"/>
+      <w:lvlJc w:val="left"/>
+      <w:pPr>
+        <w:ind w:left="2457" w:hanging="420"/>
+      </w:pPr>
+    </w:lvl>
+    <w:lvl w:ilvl="5" w:tplc="0409001B" w:tentative="1">
+      <w:start w:val="1"/>
+      <w:numFmt w:val="lowerRoman"/>
+      <w:lvlText w:val="%6."/>
+      <w:lvlJc w:val="right"/>
+      <w:pPr>
+        <w:ind w:left="2877" w:hanging="420"/>
+      </w:pPr>
+    </w:lvl>
+    <w:lvl w:ilvl="6" w:tplc="0409000F" w:tentative="1">
+      <w:start w:val="1"/>
+      <w:numFmt w:val="decimal"/>
+      <w:lvlText w:val="%7."/>
+      <w:lvlJc w:val="left"/>
+      <w:pPr>
+        <w:ind w:left="3297" w:hanging="420"/>
+      </w:pPr>
+    </w:lvl>
+    <w:lvl w:ilvl="7" w:tplc="04090019" w:tentative="1">
+      <w:start w:val="1"/>
+      <w:numFmt w:val="lowerLetter"/>
+      <w:lvlText w:val="%8)"/>
+      <w:lvlJc w:val="left"/>
+      <w:pPr>
+        <w:ind w:left="3717" w:hanging="420"/>
+      </w:pPr>
+    </w:lvl>
+    <w:lvl w:ilvl="8" w:tplc="0409001B" w:tentative="1">
+      <w:start w:val="1"/>
+      <w:numFmt w:val="lowerRoman"/>
+      <w:lvlText w:val="%9."/>
+      <w:lvlJc w:val="right"/>
+      <w:pPr>
+        <w:ind w:left="4137" w:hanging="420"/>
+      </w:pPr>
+    </w:lvl>
+  </w:abstractNum>
+  <w:abstractNum w:abstractNumId="38">
     <w:nsid w:val="78081197"/>
     <w:multiLevelType w:val="hybridMultilevel"/>
     <w:tmpl w:val="42A08576"/>
@@ -28073,7 +28659,7 @@
       </w:pPr>
     </w:lvl>
   </w:abstractNum>
-  <w:abstractNum w:abstractNumId="37">
+  <w:abstractNum w:abstractNumId="39">
     <w:nsid w:val="79A21979"/>
     <w:multiLevelType w:val="hybridMultilevel"/>
     <w:tmpl w:val="542C8574"/>
@@ -28159,7 +28745,7 @@
       </w:pPr>
     </w:lvl>
   </w:abstractNum>
-  <w:abstractNum w:abstractNumId="38">
+  <w:abstractNum w:abstractNumId="40">
     <w:nsid w:val="7DA03056"/>
     <w:multiLevelType w:val="hybridMultilevel"/>
     <w:tmpl w:val="31B6A236"/>
@@ -28245,7 +28831,7 @@
       </w:pPr>
     </w:lvl>
   </w:abstractNum>
-  <w:abstractNum w:abstractNumId="39">
+  <w:abstractNum w:abstractNumId="41">
     <w:nsid w:val="7E6E1322"/>
     <w:multiLevelType w:val="hybridMultilevel"/>
     <w:tmpl w:val="542C8574"/>
@@ -28331,7 +28917,7 @@
       </w:pPr>
     </w:lvl>
   </w:abstractNum>
-  <w:abstractNum w:abstractNumId="40">
+  <w:abstractNum w:abstractNumId="42">
     <w:nsid w:val="7F872A9E"/>
     <w:multiLevelType w:val="hybridMultilevel"/>
     <w:tmpl w:val="7526D4A8"/>
@@ -28417,7 +29003,7 @@
       </w:pPr>
     </w:lvl>
   </w:abstractNum>
-  <w:abstractNum w:abstractNumId="41">
+  <w:abstractNum w:abstractNumId="43">
     <w:nsid w:val="7F9545AD"/>
     <w:multiLevelType w:val="hybridMultilevel"/>
     <w:tmpl w:val="F30A5848"/>
@@ -28507,16 +29093,16 @@
     <w:abstractNumId w:val="13"/>
   </w:num>
   <w:num w:numId="2">
-    <w:abstractNumId w:val="40"/>
+    <w:abstractNumId w:val="42"/>
   </w:num>
   <w:num w:numId="3">
-    <w:abstractNumId w:val="29"/>
+    <w:abstractNumId w:val="30"/>
   </w:num>
   <w:num w:numId="4">
     <w:abstractNumId w:val="24"/>
   </w:num>
   <w:num w:numId="5">
-    <w:abstractNumId w:val="29"/>
+    <w:abstractNumId w:val="30"/>
     <w:lvlOverride w:ilvl="0">
       <w:startOverride w:val="1"/>
     </w:lvlOverride>
@@ -28528,10 +29114,10 @@
     <w:abstractNumId w:val="11"/>
   </w:num>
   <w:num w:numId="8">
-    <w:abstractNumId w:val="27"/>
+    <w:abstractNumId w:val="28"/>
   </w:num>
   <w:num w:numId="9">
-    <w:abstractNumId w:val="29"/>
+    <w:abstractNumId w:val="30"/>
     <w:lvlOverride w:ilvl="0">
       <w:startOverride w:val="1"/>
     </w:lvlOverride>
@@ -28543,16 +29129,16 @@
     <w:abstractNumId w:val="8"/>
   </w:num>
   <w:num w:numId="12">
-    <w:abstractNumId w:val="41"/>
+    <w:abstractNumId w:val="43"/>
   </w:num>
   <w:num w:numId="13">
-    <w:abstractNumId w:val="32"/>
+    <w:abstractNumId w:val="33"/>
   </w:num>
   <w:num w:numId="14">
     <w:abstractNumId w:val="20"/>
   </w:num>
   <w:num w:numId="15">
-    <w:abstractNumId w:val="33"/>
+    <w:abstractNumId w:val="34"/>
   </w:num>
   <w:num w:numId="16">
     <w:abstractNumId w:val="14"/>
@@ -28576,37 +29162,37 @@
     <w:abstractNumId w:val="12"/>
   </w:num>
   <w:num w:numId="23">
-    <w:abstractNumId w:val="29"/>
+    <w:abstractNumId w:val="30"/>
     <w:lvlOverride w:ilvl="0">
       <w:startOverride w:val="1"/>
     </w:lvlOverride>
   </w:num>
   <w:num w:numId="24">
-    <w:abstractNumId w:val="35"/>
+    <w:abstractNumId w:val="36"/>
   </w:num>
   <w:num w:numId="25">
     <w:abstractNumId w:val="25"/>
   </w:num>
   <w:num w:numId="26">
-    <w:abstractNumId w:val="31"/>
+    <w:abstractNumId w:val="32"/>
   </w:num>
   <w:num w:numId="27">
     <w:abstractNumId w:val="21"/>
   </w:num>
   <w:num w:numId="28">
-    <w:abstractNumId w:val="37"/>
+    <w:abstractNumId w:val="39"/>
   </w:num>
   <w:num w:numId="29">
-    <w:abstractNumId w:val="26"/>
+    <w:abstractNumId w:val="27"/>
   </w:num>
   <w:num w:numId="30">
-    <w:abstractNumId w:val="38"/>
+    <w:abstractNumId w:val="40"/>
   </w:num>
   <w:num w:numId="31">
     <w:abstractNumId w:val="7"/>
   </w:num>
   <w:num w:numId="32">
-    <w:abstractNumId w:val="28"/>
+    <w:abstractNumId w:val="29"/>
   </w:num>
   <w:num w:numId="33">
     <w:abstractNumId w:val="18"/>
@@ -28615,7 +29201,7 @@
     <w:abstractNumId w:val="10"/>
   </w:num>
   <w:num w:numId="35">
-    <w:abstractNumId w:val="30"/>
+    <w:abstractNumId w:val="31"/>
   </w:num>
   <w:num w:numId="36">
     <w:abstractNumId w:val="1"/>
@@ -28624,13 +29210,13 @@
     <w:abstractNumId w:val="4"/>
   </w:num>
   <w:num w:numId="38">
-    <w:abstractNumId w:val="36"/>
+    <w:abstractNumId w:val="38"/>
   </w:num>
   <w:num w:numId="39">
     <w:abstractNumId w:val="9"/>
   </w:num>
   <w:num w:numId="40">
-    <w:abstractNumId w:val="34"/>
+    <w:abstractNumId w:val="35"/>
   </w:num>
   <w:num w:numId="41">
     <w:abstractNumId w:val="16"/>
@@ -28642,10 +29228,16 @@
     <w:abstractNumId w:val="17"/>
   </w:num>
   <w:num w:numId="44">
-    <w:abstractNumId w:val="39"/>
+    <w:abstractNumId w:val="41"/>
   </w:num>
   <w:num w:numId="45">
     <w:abstractNumId w:val="19"/>
+  </w:num>
+  <w:num w:numId="46">
+    <w:abstractNumId w:val="37"/>
+  </w:num>
+  <w:num w:numId="47">
+    <w:abstractNumId w:val="26"/>
   </w:num>
   <w:numIdMacAtCleanup w:val="41"/>
 </w:numbering>
@@ -29836,25 +30428,25 @@
             </c:numRef>
           </c:val>
         </c:ser>
-        <c:axId val="100266752"/>
-        <c:axId val="100268288"/>
+        <c:axId val="128994688"/>
+        <c:axId val="142115584"/>
       </c:barChart>
       <c:catAx>
-        <c:axId val="100266752"/>
+        <c:axId val="128994688"/>
         <c:scaling>
           <c:orientation val="minMax"/>
         </c:scaling>
         <c:axPos val="b"/>
         <c:numFmt formatCode="General" sourceLinked="1"/>
         <c:tickLblPos val="nextTo"/>
-        <c:crossAx val="100268288"/>
+        <c:crossAx val="142115584"/>
         <c:crosses val="autoZero"/>
         <c:auto val="1"/>
         <c:lblAlgn val="ctr"/>
         <c:lblOffset val="100"/>
       </c:catAx>
       <c:valAx>
-        <c:axId val="100268288"/>
+        <c:axId val="142115584"/>
         <c:scaling>
           <c:orientation val="minMax"/>
         </c:scaling>
@@ -29862,7 +30454,7 @@
         <c:majorGridlines/>
         <c:numFmt formatCode="General" sourceLinked="1"/>
         <c:tickLblPos val="nextTo"/>
-        <c:crossAx val="100266752"/>
+        <c:crossAx val="128994688"/>
         <c:crosses val="autoZero"/>
         <c:crossBetween val="between"/>
       </c:valAx>
@@ -30176,25 +30768,25 @@
             </c:numRef>
           </c:val>
         </c:ser>
-        <c:axId val="99873536"/>
-        <c:axId val="99875072"/>
+        <c:axId val="146057472"/>
+        <c:axId val="152052864"/>
       </c:barChart>
       <c:catAx>
-        <c:axId val="99873536"/>
+        <c:axId val="146057472"/>
         <c:scaling>
           <c:orientation val="minMax"/>
         </c:scaling>
         <c:axPos val="b"/>
         <c:numFmt formatCode="General" sourceLinked="1"/>
         <c:tickLblPos val="nextTo"/>
-        <c:crossAx val="99875072"/>
+        <c:crossAx val="152052864"/>
         <c:crosses val="autoZero"/>
         <c:auto val="1"/>
         <c:lblAlgn val="ctr"/>
         <c:lblOffset val="100"/>
       </c:catAx>
       <c:valAx>
-        <c:axId val="99875072"/>
+        <c:axId val="152052864"/>
         <c:scaling>
           <c:orientation val="minMax"/>
         </c:scaling>
@@ -30202,7 +30794,7 @@
         <c:majorGridlines/>
         <c:numFmt formatCode="General" sourceLinked="1"/>
         <c:tickLblPos val="nextTo"/>
-        <c:crossAx val="99873536"/>
+        <c:crossAx val="146057472"/>
         <c:crosses val="autoZero"/>
         <c:crossBetween val="between"/>
       </c:valAx>
@@ -30517,25 +31109,25 @@
             </c:numRef>
           </c:val>
         </c:ser>
-        <c:axId val="146858752"/>
-        <c:axId val="146860288"/>
+        <c:axId val="238828544"/>
+        <c:axId val="249796096"/>
       </c:barChart>
       <c:catAx>
-        <c:axId val="146858752"/>
+        <c:axId val="238828544"/>
         <c:scaling>
           <c:orientation val="minMax"/>
         </c:scaling>
         <c:axPos val="b"/>
         <c:numFmt formatCode="General" sourceLinked="1"/>
         <c:tickLblPos val="nextTo"/>
-        <c:crossAx val="146860288"/>
+        <c:crossAx val="249796096"/>
         <c:crosses val="autoZero"/>
         <c:auto val="1"/>
         <c:lblAlgn val="ctr"/>
         <c:lblOffset val="100"/>
       </c:catAx>
       <c:valAx>
-        <c:axId val="146860288"/>
+        <c:axId val="249796096"/>
         <c:scaling>
           <c:orientation val="minMax"/>
         </c:scaling>
@@ -30543,7 +31135,7 @@
         <c:majorGridlines/>
         <c:numFmt formatCode="General" sourceLinked="1"/>
         <c:tickLblPos val="nextTo"/>
-        <c:crossAx val="146858752"/>
+        <c:crossAx val="238828544"/>
         <c:crosses val="autoZero"/>
         <c:crossBetween val="between"/>
       </c:valAx>
@@ -30822,24 +31414,24 @@
             </c:numRef>
           </c:val>
         </c:ser>
-        <c:axId val="146813696"/>
-        <c:axId val="146815232"/>
+        <c:axId val="61206912"/>
+        <c:axId val="61208448"/>
       </c:barChart>
       <c:catAx>
-        <c:axId val="146813696"/>
+        <c:axId val="61206912"/>
         <c:scaling>
           <c:orientation val="minMax"/>
         </c:scaling>
         <c:axPos val="b"/>
         <c:tickLblPos val="nextTo"/>
-        <c:crossAx val="146815232"/>
+        <c:crossAx val="61208448"/>
         <c:crosses val="autoZero"/>
         <c:auto val="1"/>
         <c:lblAlgn val="ctr"/>
         <c:lblOffset val="100"/>
       </c:catAx>
       <c:valAx>
-        <c:axId val="146815232"/>
+        <c:axId val="61208448"/>
         <c:scaling>
           <c:orientation val="minMax"/>
         </c:scaling>
@@ -30847,7 +31439,7 @@
         <c:majorGridlines/>
         <c:numFmt formatCode="General" sourceLinked="1"/>
         <c:tickLblPos val="nextTo"/>
-        <c:crossAx val="146813696"/>
+        <c:crossAx val="61206912"/>
         <c:crosses val="autoZero"/>
         <c:crossBetween val="between"/>
       </c:valAx>
@@ -31012,7 +31604,7 @@
                   <c:v>19257</c:v>
                 </c:pt>
                 <c:pt idx="1">
-                  <c:v>16757.599999999948</c:v>
+                  <c:v>16757.59999999994</c:v>
                 </c:pt>
                 <c:pt idx="2">
                   <c:v>13230</c:v>
@@ -31121,24 +31713,24 @@
             </c:numRef>
           </c:val>
         </c:ser>
-        <c:axId val="147059456"/>
-        <c:axId val="147060992"/>
+        <c:axId val="126448000"/>
+        <c:axId val="126449536"/>
       </c:barChart>
       <c:catAx>
-        <c:axId val="147059456"/>
+        <c:axId val="126448000"/>
         <c:scaling>
           <c:orientation val="minMax"/>
         </c:scaling>
         <c:axPos val="b"/>
         <c:tickLblPos val="nextTo"/>
-        <c:crossAx val="147060992"/>
+        <c:crossAx val="126449536"/>
         <c:crosses val="autoZero"/>
         <c:auto val="1"/>
         <c:lblAlgn val="ctr"/>
         <c:lblOffset val="100"/>
       </c:catAx>
       <c:valAx>
-        <c:axId val="147060992"/>
+        <c:axId val="126449536"/>
         <c:scaling>
           <c:orientation val="minMax"/>
         </c:scaling>
@@ -31146,7 +31738,7 @@
         <c:majorGridlines/>
         <c:numFmt formatCode="General" sourceLinked="1"/>
         <c:tickLblPos val="nextTo"/>
-        <c:crossAx val="147059456"/>
+        <c:crossAx val="126448000"/>
         <c:crosses val="autoZero"/>
         <c:crossBetween val="between"/>
       </c:valAx>

</xml_diff>

<commit_message>
SEQUOIADBMAINSTREAM-4495: update document Story_查询计划缓存优化.docx
git-svn-id: http://192.168.20.11/sequoiadb/trunk@41257 6121f079-4a18-41d3-8c30-8870a322f2c2
</commit_message>
<xml_diff>
--- a/internal_doc/03.开发设计/性能/Story_查询计划缓存优化.docx
+++ b/internal_doc/03.开发设计/性能/Story_查询计划缓存优化.docx
@@ -4567,12 +4567,26 @@
     <w:p>
       <w:pPr>
         <w:pStyle w:val="Heading4"/>
+        <w:rPr>
+          <w:rFonts w:hint="eastAsia"/>
+        </w:rPr>
       </w:pPr>
       <w:r>
         <w:rPr>
           <w:rFonts w:hint="eastAsia"/>
         </w:rPr>
         <w:t>缓存计划的淘汰</w:t>
+      </w:r>
+    </w:p>
+    <w:p>
+      <w:pPr>
+        <w:pStyle w:val="Heading5"/>
+      </w:pPr>
+      <w:r>
+        <w:rPr>
+          <w:rFonts w:hint="eastAsia"/>
+        </w:rPr>
+        <w:t>缓存清理淘汰</w:t>
       </w:r>
     </w:p>
     <w:p>
@@ -4960,6 +4974,7 @@
         <w:rPr>
           <w:rFonts w:hint="eastAsia"/>
         </w:rPr>
+        <w:lastRenderedPageBreak/>
         <w:t>如果</w:t>
       </w:r>
       <w:r>
@@ -5050,7 +5065,6 @@
         <w:rPr>
           <w:rFonts w:hint="eastAsia"/>
         </w:rPr>
-        <w:lastRenderedPageBreak/>
         <w:t>评分标准：访问次数越多，访问时间越晚，评分越高</w:t>
       </w:r>
     </w:p>
@@ -5233,6 +5247,737 @@
         <w:ind w:left="777"/>
       </w:pPr>
     </w:p>
+    <w:p>
+      <w:pPr>
+        <w:pStyle w:val="Heading5"/>
+        <w:rPr>
+          <w:rFonts w:hint="eastAsia"/>
+        </w:rPr>
+      </w:pPr>
+      <w:r>
+        <w:rPr>
+          <w:rFonts w:hint="eastAsia"/>
+        </w:rPr>
+        <w:t>过时</w:t>
+      </w:r>
+      <w:r>
+        <w:rPr>
+          <w:rFonts w:hint="eastAsia"/>
+        </w:rPr>
+        <w:t>淘汰</w:t>
+      </w:r>
+    </w:p>
+    <w:p>
+      <w:pPr>
+        <w:rPr>
+          <w:rFonts w:hint="eastAsia"/>
+        </w:rPr>
+      </w:pPr>
+      <w:r>
+        <w:rPr>
+          <w:rFonts w:hint="eastAsia"/>
+        </w:rPr>
+        <w:t>当</w:t>
+      </w:r>
+      <w:r>
+        <w:rPr>
+          <w:rFonts w:hint="eastAsia"/>
+        </w:rPr>
+        <w:t xml:space="preserve"> collection </w:t>
+      </w:r>
+      <w:r>
+        <w:rPr>
+          <w:rFonts w:hint="eastAsia"/>
+        </w:rPr>
+        <w:t>的数据量发生较大的变化</w:t>
+      </w:r>
+      <w:r>
+        <w:rPr>
+          <w:rFonts w:hint="eastAsia"/>
+        </w:rPr>
+        <w:t>时</w:t>
+      </w:r>
+      <w:r>
+        <w:rPr>
+          <w:rFonts w:hint="eastAsia"/>
+        </w:rPr>
+        <w:t>，认为缓存的查询计划和生成查询计划的统计信息过期，</w:t>
+      </w:r>
+      <w:r>
+        <w:rPr>
+          <w:rFonts w:hint="eastAsia"/>
+        </w:rPr>
+        <w:t>暂时不再</w:t>
+      </w:r>
+      <w:r>
+        <w:rPr>
+          <w:rFonts w:hint="eastAsia"/>
+        </w:rPr>
+        <w:t>使用</w:t>
+      </w:r>
+      <w:r>
+        <w:rPr>
+          <w:rFonts w:hint="eastAsia"/>
+        </w:rPr>
+        <w:t>：</w:t>
+      </w:r>
+    </w:p>
+    <w:p>
+      <w:pPr>
+        <w:rPr>
+          <w:rFonts w:hint="eastAsia"/>
+        </w:rPr>
+      </w:pPr>
+    </w:p>
+    <w:p>
+      <w:pPr>
+        <w:pStyle w:val="ListParagraph"/>
+        <w:numPr>
+          <w:ilvl w:val="0"/>
+          <w:numId w:val="48"/>
+        </w:numPr>
+        <w:ind w:firstLineChars="0"/>
+        <w:rPr>
+          <w:rFonts w:hint="eastAsia"/>
+        </w:rPr>
+      </w:pPr>
+      <w:r>
+        <w:rPr>
+          <w:rFonts w:hint="eastAsia"/>
+        </w:rPr>
+        <w:t>当</w:t>
+      </w:r>
+      <w:r>
+        <w:rPr>
+          <w:rFonts w:hint="eastAsia"/>
+        </w:rPr>
+        <w:t xml:space="preserve"> collection </w:t>
+      </w:r>
+      <w:r>
+        <w:rPr>
+          <w:rFonts w:hint="eastAsia"/>
+        </w:rPr>
+        <w:t>的当前数据页数和缓存的</w:t>
+      </w:r>
+      <w:r>
+        <w:rPr>
+          <w:rFonts w:hint="eastAsia"/>
+        </w:rPr>
+        <w:t>查询计划（或者统计信息）记录的</w:t>
+      </w:r>
+      <w:r>
+        <w:rPr>
+          <w:rFonts w:hint="eastAsia"/>
+        </w:rPr>
+        <w:t>数据页数</w:t>
+      </w:r>
+      <w:r>
+        <w:rPr>
+          <w:rFonts w:hint="eastAsia"/>
+        </w:rPr>
+        <w:t xml:space="preserve"> </w:t>
+      </w:r>
+      <w:r>
+        <w:rPr>
+          <w:rFonts w:hint="eastAsia"/>
+        </w:rPr>
+        <w:t>都小于</w:t>
+      </w:r>
+      <w:r>
+        <w:rPr>
+          <w:rFonts w:hint="eastAsia"/>
+        </w:rPr>
+        <w:t xml:space="preserve"> optcostthreshold </w:t>
+      </w:r>
+      <w:r>
+        <w:rPr>
+          <w:rFonts w:hint="eastAsia"/>
+        </w:rPr>
+        <w:t>（默认</w:t>
+      </w:r>
+      <w:r>
+        <w:rPr>
+          <w:rFonts w:hint="eastAsia"/>
+        </w:rPr>
+        <w:t xml:space="preserve"> 20</w:t>
+      </w:r>
+      <w:r>
+        <w:rPr>
+          <w:rFonts w:hint="eastAsia"/>
+        </w:rPr>
+        <w:t>）时，判定为</w:t>
+      </w:r>
+      <w:r>
+        <w:rPr>
+          <w:rFonts w:hint="eastAsia"/>
+          <w:b/>
+          <w:color w:val="FF0000"/>
+        </w:rPr>
+        <w:t>不过时</w:t>
+      </w:r>
+    </w:p>
+    <w:p>
+      <w:pPr>
+        <w:pStyle w:val="ListParagraph"/>
+        <w:numPr>
+          <w:ilvl w:val="1"/>
+          <w:numId w:val="48"/>
+        </w:numPr>
+        <w:ind w:firstLineChars="0"/>
+        <w:rPr>
+          <w:rFonts w:hint="eastAsia"/>
+        </w:rPr>
+      </w:pPr>
+      <w:r>
+        <w:rPr>
+          <w:rFonts w:hint="eastAsia"/>
+        </w:rPr>
+        <w:t>缓存的</w:t>
+      </w:r>
+      <w:r>
+        <w:rPr>
+          <w:rFonts w:hint="eastAsia"/>
+        </w:rPr>
+        <w:t>查询计划（或者统计信息）</w:t>
+      </w:r>
+      <w:r>
+        <w:rPr>
+          <w:rFonts w:hint="eastAsia"/>
+        </w:rPr>
+        <w:t>记录查询计划（或者统计信息）生成时</w:t>
+      </w:r>
+      <w:r>
+        <w:rPr>
+          <w:rFonts w:hint="eastAsia"/>
+        </w:rPr>
+        <w:t xml:space="preserve"> collection </w:t>
+      </w:r>
+      <w:r>
+        <w:rPr>
+          <w:rFonts w:hint="eastAsia"/>
+        </w:rPr>
+        <w:t>的数据页数</w:t>
+      </w:r>
+    </w:p>
+    <w:p>
+      <w:pPr>
+        <w:pStyle w:val="ListParagraph"/>
+        <w:numPr>
+          <w:ilvl w:val="1"/>
+          <w:numId w:val="48"/>
+        </w:numPr>
+        <w:ind w:firstLineChars="0"/>
+        <w:rPr>
+          <w:rFonts w:hint="eastAsia"/>
+        </w:rPr>
+      </w:pPr>
+      <w:r>
+        <w:rPr>
+          <w:rFonts w:hint="eastAsia"/>
+        </w:rPr>
+        <w:t>当前数据页数由</w:t>
+      </w:r>
+      <w:r>
+        <w:rPr>
+          <w:rFonts w:hint="eastAsia"/>
+        </w:rPr>
+        <w:t xml:space="preserve"> mbContext </w:t>
+      </w:r>
+      <w:r>
+        <w:rPr>
+          <w:rFonts w:hint="eastAsia"/>
+        </w:rPr>
+        <w:t>计算</w:t>
+      </w:r>
+      <w:r>
+        <w:br/>
+      </w:r>
+      <m:oMathPara>
+        <m:oMath>
+          <m:r>
+            <m:rPr>
+              <m:sty m:val="p"/>
+            </m:rPr>
+            <w:rPr>
+              <w:rFonts w:ascii="Cambria Math" w:hAnsi="Cambria Math" w:hint="eastAsia"/>
+            </w:rPr>
+            <m:t>usedPages=totalPages</m:t>
+          </m:r>
+          <m:r>
+            <m:rPr>
+              <m:sty m:val="p"/>
+            </m:rPr>
+            <w:rPr>
+              <w:rFonts w:ascii="MS Mincho" w:eastAsia="MS Mincho" w:hAnsi="MS Mincho" w:cs="MS Mincho" w:hint="eastAsia"/>
+            </w:rPr>
+            <m:t>-</m:t>
+          </m:r>
+          <m:r>
+            <m:rPr>
+              <m:sty m:val="p"/>
+            </m:rPr>
+            <w:rPr>
+              <w:rFonts w:ascii="Cambria Math" w:hAnsi="Cambria Math" w:hint="eastAsia"/>
+            </w:rPr>
+            <m:t>totalFreePages/</m:t>
+          </m:r>
+          <m:r>
+            <m:rPr>
+              <m:sty m:val="p"/>
+            </m:rPr>
+            <w:rPr>
+              <w:rFonts w:ascii="Cambria Math" w:hAnsi="Cambria Math"/>
+            </w:rPr>
+            <m:t>pageSize</m:t>
+          </m:r>
+        </m:oMath>
+      </m:oMathPara>
+    </w:p>
+    <w:p>
+      <w:pPr>
+        <w:pStyle w:val="ListParagraph"/>
+        <w:numPr>
+          <w:ilvl w:val="1"/>
+          <w:numId w:val="48"/>
+        </w:numPr>
+        <w:ind w:firstLineChars="0"/>
+        <w:rPr>
+          <w:rFonts w:hint="eastAsia"/>
+        </w:rPr>
+      </w:pPr>
+      <w:r>
+        <w:rPr>
+          <w:rFonts w:hint="eastAsia"/>
+        </w:rPr>
+        <w:t xml:space="preserve">optcostthreshold </w:t>
+      </w:r>
+      <w:r>
+        <w:rPr>
+          <w:rFonts w:hint="eastAsia"/>
+        </w:rPr>
+        <w:t>为</w:t>
+      </w:r>
+      <w:r>
+        <w:rPr>
+          <w:rFonts w:hint="eastAsia"/>
+        </w:rPr>
+        <w:t xml:space="preserve"> SequoiaDB </w:t>
+      </w:r>
+      <w:r>
+        <w:rPr>
+          <w:rFonts w:hint="eastAsia"/>
+        </w:rPr>
+        <w:t>参数</w:t>
+      </w:r>
+      <w:r>
+        <w:rPr>
+          <w:rFonts w:hint="eastAsia"/>
+        </w:rPr>
+        <w:t>（</w:t>
+      </w:r>
+      <w:r>
+        <w:rPr>
+          <w:rFonts w:hint="eastAsia"/>
+        </w:rPr>
+        <w:t>查询优化器忽略</w:t>
+      </w:r>
+      <w:r>
+        <w:rPr>
+          <w:rFonts w:hint="eastAsia"/>
+        </w:rPr>
+        <w:t>IO</w:t>
+      </w:r>
+      <w:r>
+        <w:rPr>
+          <w:rFonts w:hint="eastAsia"/>
+        </w:rPr>
+        <w:t>影响的最小的页数</w:t>
+      </w:r>
+      <w:r>
+        <w:rPr>
+          <w:rFonts w:hint="eastAsia"/>
+        </w:rPr>
+        <w:t>，默认为</w:t>
+      </w:r>
+      <w:r>
+        <w:rPr>
+          <w:rFonts w:hint="eastAsia"/>
+        </w:rPr>
+        <w:t xml:space="preserve"> 20</w:t>
+      </w:r>
+      <w:r>
+        <w:rPr>
+          <w:rFonts w:hint="eastAsia"/>
+        </w:rPr>
+        <w:t>）</w:t>
+      </w:r>
+    </w:p>
+    <w:p>
+      <w:pPr>
+        <w:pStyle w:val="ListParagraph"/>
+        <w:numPr>
+          <w:ilvl w:val="0"/>
+          <w:numId w:val="48"/>
+        </w:numPr>
+        <w:ind w:firstLineChars="0"/>
+        <w:rPr>
+          <w:rFonts w:hint="eastAsia"/>
+        </w:rPr>
+      </w:pPr>
+      <w:r>
+        <w:rPr>
+          <w:rFonts w:hint="eastAsia"/>
+        </w:rPr>
+        <w:t>当</w:t>
+      </w:r>
+      <w:r>
+        <w:rPr>
+          <w:rFonts w:hint="eastAsia"/>
+        </w:rPr>
+        <w:t xml:space="preserve"> collection </w:t>
+      </w:r>
+      <w:r>
+        <w:rPr>
+          <w:rFonts w:hint="eastAsia"/>
+        </w:rPr>
+        <w:t>的当前数据页数和</w:t>
+      </w:r>
+      <w:r>
+        <w:rPr>
+          <w:rFonts w:hint="eastAsia"/>
+        </w:rPr>
+        <w:t>缓存的</w:t>
+      </w:r>
+      <w:r>
+        <w:rPr>
+          <w:rFonts w:hint="eastAsia"/>
+        </w:rPr>
+        <w:t>查询计划（或者统计信息）记录的</w:t>
+      </w:r>
+      <w:r>
+        <w:rPr>
+          <w:rFonts w:hint="eastAsia"/>
+        </w:rPr>
+        <w:t>数据页数，其中一个大于</w:t>
+      </w:r>
+      <w:r>
+        <w:rPr>
+          <w:rFonts w:hint="eastAsia"/>
+        </w:rPr>
+        <w:t xml:space="preserve"> </w:t>
+      </w:r>
+      <w:r>
+        <w:rPr>
+          <w:rFonts w:hint="eastAsia"/>
+        </w:rPr>
+        <w:t>optcostthreshold</w:t>
+      </w:r>
+      <w:r>
+        <w:rPr>
+          <w:rFonts w:hint="eastAsia"/>
+        </w:rPr>
+        <w:t>，另外一个小于等于</w:t>
+      </w:r>
+      <w:r>
+        <w:rPr>
+          <w:rFonts w:hint="eastAsia"/>
+        </w:rPr>
+        <w:t xml:space="preserve"> optcostthreshold</w:t>
+      </w:r>
+      <w:r>
+        <w:rPr>
+          <w:rFonts w:hint="eastAsia"/>
+        </w:rPr>
+        <w:t>，判定为</w:t>
+      </w:r>
+      <w:r>
+        <w:rPr>
+          <w:rFonts w:hint="eastAsia"/>
+          <w:b/>
+          <w:color w:val="FF0000"/>
+        </w:rPr>
+        <w:t>过时</w:t>
+      </w:r>
+    </w:p>
+    <w:p>
+      <w:pPr>
+        <w:pStyle w:val="ListParagraph"/>
+        <w:numPr>
+          <w:ilvl w:val="0"/>
+          <w:numId w:val="48"/>
+        </w:numPr>
+        <w:ind w:firstLineChars="0"/>
+        <w:rPr>
+          <w:rFonts w:hint="eastAsia"/>
+        </w:rPr>
+      </w:pPr>
+      <w:r>
+        <w:rPr>
+          <w:rFonts w:hint="eastAsia"/>
+        </w:rPr>
+        <w:t>当</w:t>
+      </w:r>
+      <w:r>
+        <w:rPr>
+          <w:rFonts w:hint="eastAsia"/>
+        </w:rPr>
+        <w:t xml:space="preserve"> collection </w:t>
+      </w:r>
+      <w:r>
+        <w:rPr>
+          <w:rFonts w:hint="eastAsia"/>
+        </w:rPr>
+        <w:t>的当前数据页数和</w:t>
+      </w:r>
+      <w:r>
+        <w:rPr>
+          <w:rFonts w:hint="eastAsia"/>
+        </w:rPr>
+        <w:t>缓存的</w:t>
+      </w:r>
+      <w:r>
+        <w:rPr>
+          <w:rFonts w:hint="eastAsia"/>
+        </w:rPr>
+        <w:t>查询计划（或者统计信息）记录的</w:t>
+      </w:r>
+      <w:r>
+        <w:rPr>
+          <w:rFonts w:hint="eastAsia"/>
+        </w:rPr>
+        <w:t>数据页数</w:t>
+      </w:r>
+      <w:r>
+        <w:rPr>
+          <w:rFonts w:hint="eastAsia"/>
+        </w:rPr>
+        <w:t>都大于</w:t>
+      </w:r>
+      <w:r>
+        <w:rPr>
+          <w:rFonts w:hint="eastAsia"/>
+        </w:rPr>
+        <w:t xml:space="preserve"> optcostthreshold </w:t>
+      </w:r>
+      <w:r>
+        <w:rPr>
+          <w:rFonts w:hint="eastAsia"/>
+        </w:rPr>
+        <w:t>时，发生以下情况时，判定为</w:t>
+      </w:r>
+      <w:r>
+        <w:rPr>
+          <w:rFonts w:hint="eastAsia"/>
+          <w:b/>
+          <w:color w:val="FF0000"/>
+        </w:rPr>
+        <w:t>过时</w:t>
+      </w:r>
+    </w:p>
+    <w:p>
+      <w:pPr>
+        <w:pStyle w:val="ListParagraph"/>
+        <w:numPr>
+          <w:ilvl w:val="1"/>
+          <w:numId w:val="48"/>
+        </w:numPr>
+        <w:ind w:firstLineChars="0"/>
+        <w:rPr>
+          <w:rFonts w:hint="eastAsia"/>
+        </w:rPr>
+      </w:pPr>
+      <w:r>
+        <w:rPr>
+          <w:rFonts w:hint="eastAsia"/>
+        </w:rPr>
+        <w:t>当</w:t>
+      </w:r>
+      <w:r>
+        <w:rPr>
+          <w:rFonts w:hint="eastAsia"/>
+        </w:rPr>
+        <w:t xml:space="preserve"> collection </w:t>
+      </w:r>
+      <w:r>
+        <w:rPr>
+          <w:rFonts w:hint="eastAsia"/>
+        </w:rPr>
+        <w:t>的当前数据页数大于</w:t>
+      </w:r>
+      <w:r>
+        <w:rPr>
+          <w:rFonts w:hint="eastAsia"/>
+        </w:rPr>
+        <w:t>缓存的</w:t>
+      </w:r>
+      <w:r>
+        <w:rPr>
+          <w:rFonts w:hint="eastAsia"/>
+        </w:rPr>
+        <w:t>查询计划（或者统计信息）记录的</w:t>
+      </w:r>
+      <w:r>
+        <w:rPr>
+          <w:rFonts w:hint="eastAsia"/>
+        </w:rPr>
+        <w:t>数据页数</w:t>
+      </w:r>
+      <w:r>
+        <w:rPr>
+          <w:rFonts w:hint="eastAsia"/>
+        </w:rPr>
+        <w:t>的</w:t>
+      </w:r>
+      <w:r>
+        <w:rPr>
+          <w:rFonts w:hint="eastAsia"/>
+        </w:rPr>
+        <w:t xml:space="preserve"> 2 </w:t>
+      </w:r>
+      <w:r>
+        <w:rPr>
+          <w:rFonts w:hint="eastAsia"/>
+        </w:rPr>
+        <w:t>倍</w:t>
+      </w:r>
+    </w:p>
+    <w:p>
+      <w:pPr>
+        <w:pStyle w:val="ListParagraph"/>
+        <w:numPr>
+          <w:ilvl w:val="1"/>
+          <w:numId w:val="48"/>
+        </w:numPr>
+        <w:ind w:firstLineChars="0"/>
+      </w:pPr>
+      <w:r>
+        <w:rPr>
+          <w:rFonts w:hint="eastAsia"/>
+        </w:rPr>
+        <w:t>当</w:t>
+      </w:r>
+      <w:r>
+        <w:rPr>
+          <w:rFonts w:hint="eastAsia"/>
+        </w:rPr>
+        <w:t xml:space="preserve"> collection </w:t>
+      </w:r>
+      <w:r>
+        <w:rPr>
+          <w:rFonts w:hint="eastAsia"/>
+        </w:rPr>
+        <w:t>的当前数据页数小于</w:t>
+      </w:r>
+      <w:r>
+        <w:rPr>
+          <w:rFonts w:hint="eastAsia"/>
+        </w:rPr>
+        <w:t>缓存的</w:t>
+      </w:r>
+      <w:r>
+        <w:rPr>
+          <w:rFonts w:hint="eastAsia"/>
+        </w:rPr>
+        <w:t>查询计划（或者统计信息）记录的</w:t>
+      </w:r>
+      <w:r>
+        <w:rPr>
+          <w:rFonts w:hint="eastAsia"/>
+        </w:rPr>
+        <w:t>数据页数</w:t>
+      </w:r>
+      <w:r>
+        <w:rPr>
+          <w:rFonts w:hint="eastAsia"/>
+        </w:rPr>
+        <w:t>的</w:t>
+      </w:r>
+      <w:r>
+        <w:rPr>
+          <w:rFonts w:hint="eastAsia"/>
+        </w:rPr>
+        <w:t xml:space="preserve"> 1/2</w:t>
+      </w:r>
+    </w:p>
+    <w:p>
+      <w:pPr>
+        <w:rPr>
+          <w:rFonts w:hint="eastAsia"/>
+        </w:rPr>
+      </w:pPr>
+    </w:p>
+    <w:p>
+      <w:pPr>
+        <w:rPr>
+          <w:rFonts w:hint="eastAsia"/>
+        </w:rPr>
+      </w:pPr>
+      <w:r>
+        <w:rPr>
+          <w:rFonts w:hint="eastAsia"/>
+        </w:rPr>
+        <w:t>在以下时间点进行过时判定：</w:t>
+      </w:r>
+      <w:r>
+        <w:rPr>
+          <w:rFonts w:hint="eastAsia"/>
+        </w:rPr>
+        <w:t xml:space="preserve"> </w:t>
+      </w:r>
+    </w:p>
+    <w:p>
+      <w:pPr>
+        <w:rPr>
+          <w:rFonts w:hint="eastAsia"/>
+        </w:rPr>
+      </w:pPr>
+    </w:p>
+    <w:p>
+      <w:pPr>
+        <w:pStyle w:val="ListParagraph"/>
+        <w:numPr>
+          <w:ilvl w:val="0"/>
+          <w:numId w:val="49"/>
+        </w:numPr>
+        <w:ind w:firstLineChars="0"/>
+        <w:rPr>
+          <w:rFonts w:hint="eastAsia"/>
+        </w:rPr>
+      </w:pPr>
+      <w:r>
+        <w:rPr>
+          <w:rFonts w:hint="eastAsia"/>
+        </w:rPr>
+        <w:t>当需要使用统计信息生成查询计划时，判定统计信息是否过时；过时则使用默认的统计信息</w:t>
+      </w:r>
+    </w:p>
+    <w:p>
+      <w:pPr>
+        <w:pStyle w:val="ListParagraph"/>
+        <w:numPr>
+          <w:ilvl w:val="0"/>
+          <w:numId w:val="49"/>
+        </w:numPr>
+        <w:ind w:firstLineChars="0"/>
+        <w:rPr>
+          <w:rFonts w:hint="eastAsia"/>
+        </w:rPr>
+      </w:pPr>
+      <w:commentRangeStart w:id="0"/>
+      <w:r>
+        <w:rPr>
+          <w:rFonts w:hint="eastAsia"/>
+        </w:rPr>
+        <w:t>当获取一个缓存的查询计划时，判定是否过时；过时则丢弃此查询计划，重新生成查询计划</w:t>
+      </w:r>
+      <w:commentRangeEnd w:id="0"/>
+      <w:r>
+        <w:rPr>
+          <w:rStyle w:val="CommentReference"/>
+        </w:rPr>
+        <w:commentReference w:id="0"/>
+      </w:r>
+    </w:p>
     <w:p/>
     <w:p>
       <w:pPr>
@@ -5242,6 +5987,7 @@
         <w:rPr>
           <w:rFonts w:hint="eastAsia"/>
         </w:rPr>
+        <w:lastRenderedPageBreak/>
         <w:t>查询计划的创建</w:t>
       </w:r>
     </w:p>
@@ -5865,7 +6611,6 @@
         <w:rPr>
           <w:rFonts w:hint="eastAsia"/>
         </w:rPr>
-        <w:lastRenderedPageBreak/>
         <w:t>参数化的查询计划</w:t>
       </w:r>
       <w:r>
@@ -5973,6 +6718,7 @@
         <w:rPr>
           <w:rFonts w:hint="eastAsia"/>
         </w:rPr>
+        <w:lastRenderedPageBreak/>
         <w:t>x</w:t>
       </w:r>
       <w:r>
@@ -6700,7 +7446,6 @@
         <w:rPr>
           <w:rFonts w:hint="eastAsia"/>
         </w:rPr>
-        <w:lastRenderedPageBreak/>
         <w:t>生成的泛化表达式：</w:t>
       </w:r>
       <w:r>
@@ -6848,6 +7593,7 @@
         <w:rPr>
           <w:rFonts w:hint="eastAsia"/>
         </w:rPr>
+        <w:lastRenderedPageBreak/>
         <w:t>$gt</w:t>
       </w:r>
       <w:r>
@@ -7139,7 +7885,7 @@
                     </pic:cNvPicPr>
                   </pic:nvPicPr>
                   <pic:blipFill>
-                    <a:blip r:embed="rId11"/>
+                    <a:blip r:embed="rId12"/>
                     <a:srcRect/>
                     <a:stretch>
                       <a:fillRect/>
@@ -10416,7 +11162,7 @@
                     </pic:cNvPicPr>
                   </pic:nvPicPr>
                   <pic:blipFill>
-                    <a:blip r:embed="rId12"/>
+                    <a:blip r:embed="rId13"/>
                     <a:srcRect/>
                     <a:stretch>
                       <a:fillRect/>
@@ -11268,7 +12014,7 @@
                     </pic:cNvPicPr>
                   </pic:nvPicPr>
                   <pic:blipFill>
-                    <a:blip r:embed="rId13"/>
+                    <a:blip r:embed="rId14"/>
                     <a:srcRect/>
                     <a:stretch>
                       <a:fillRect/>
@@ -11516,219 +12262,6 @@
                 <pic:pic xmlns:pic="http://schemas.openxmlformats.org/drawingml/2006/picture">
                   <pic:nvPicPr>
                     <pic:cNvPr id="0" name="Picture 12"/>
-                    <pic:cNvPicPr>
-                      <a:picLocks noChangeAspect="1" noChangeArrowheads="1"/>
-                    </pic:cNvPicPr>
-                  </pic:nvPicPr>
-                  <pic:blipFill>
-                    <a:blip r:embed="rId14"/>
-                    <a:srcRect/>
-                    <a:stretch>
-                      <a:fillRect/>
-                    </a:stretch>
-                  </pic:blipFill>
-                  <pic:spPr bwMode="auto">
-                    <a:xfrm>
-                      <a:off x="0" y="0"/>
-                      <a:ext cx="5274310" cy="2971345"/>
-                    </a:xfrm>
-                    <a:prstGeom prst="rect">
-                      <a:avLst/>
-                    </a:prstGeom>
-                    <a:noFill/>
-                    <a:ln w="9525">
-                      <a:noFill/>
-                      <a:miter lim="800000"/>
-                      <a:headEnd/>
-                      <a:tailEnd/>
-                    </a:ln>
-                  </pic:spPr>
-                </pic:pic>
-              </a:graphicData>
-            </a:graphic>
-          </wp:inline>
-        </w:drawing>
-      </w:r>
-    </w:p>
-    <w:p/>
-    <w:p>
-      <w:pPr>
-        <w:pStyle w:val="Heading4"/>
-      </w:pPr>
-      <w:r>
-        <w:rPr>
-          <w:rFonts w:hint="eastAsia"/>
-        </w:rPr>
-        <w:t>OPT_PLAN_PARAMETERIZED</w:t>
-      </w:r>
-    </w:p>
-    <w:p>
-      <w:pPr>
-        <w:pStyle w:val="ListParagraph"/>
-        <w:numPr>
-          <w:ilvl w:val="0"/>
-          <w:numId w:val="36"/>
-        </w:numPr>
-        <w:ind w:firstLineChars="0"/>
-      </w:pPr>
-      <w:r>
-        <w:rPr>
-          <w:rFonts w:hint="eastAsia"/>
-        </w:rPr>
-        <w:t>mthMatchTree</w:t>
-      </w:r>
-      <w:r>
-        <w:rPr>
-          <w:rFonts w:hint="eastAsia"/>
-        </w:rPr>
-        <w:t>可以确定，因此挂在</w:t>
-      </w:r>
-      <w:r>
-        <w:rPr>
-          <w:rFonts w:hint="eastAsia"/>
-        </w:rPr>
-        <w:t>optParamAccessPlan</w:t>
-      </w:r>
-      <w:r>
-        <w:rPr>
-          <w:rFonts w:hint="eastAsia"/>
-        </w:rPr>
-        <w:t>中，并存储在缓存中</w:t>
-      </w:r>
-    </w:p>
-    <w:p>
-      <w:pPr>
-        <w:pStyle w:val="ListParagraph"/>
-        <w:numPr>
-          <w:ilvl w:val="1"/>
-          <w:numId w:val="36"/>
-        </w:numPr>
-        <w:ind w:firstLineChars="0"/>
-      </w:pPr>
-      <w:r>
-        <w:rPr>
-          <w:rFonts w:hint="eastAsia"/>
-        </w:rPr>
-        <w:t>mthMatchTreeRuntime</w:t>
-      </w:r>
-      <w:r>
-        <w:rPr>
-          <w:rFonts w:hint="eastAsia"/>
-        </w:rPr>
-        <w:t>中通过指针引用</w:t>
-      </w:r>
-    </w:p>
-    <w:p>
-      <w:pPr>
-        <w:pStyle w:val="ListParagraph"/>
-        <w:numPr>
-          <w:ilvl w:val="0"/>
-          <w:numId w:val="36"/>
-        </w:numPr>
-        <w:ind w:firstLineChars="0"/>
-      </w:pPr>
-      <w:r>
-        <w:rPr>
-          <w:rFonts w:hint="eastAsia"/>
-        </w:rPr>
-        <w:t>因为参数化，所以</w:t>
-      </w:r>
-      <w:r>
-        <w:rPr>
-          <w:rFonts w:hint="eastAsia"/>
-        </w:rPr>
-        <w:t>predicates</w:t>
-      </w:r>
-      <w:r>
-        <w:rPr>
-          <w:rFonts w:hint="eastAsia"/>
-        </w:rPr>
-        <w:t>不可以确定，所以挂在</w:t>
-      </w:r>
-      <w:r>
-        <w:rPr>
-          <w:rFonts w:hint="eastAsia"/>
-        </w:rPr>
-        <w:t>optAccessPlanRuntime</w:t>
-      </w:r>
-      <w:r>
-        <w:rPr>
-          <w:rFonts w:hint="eastAsia"/>
-        </w:rPr>
-        <w:t>的</w:t>
-      </w:r>
-      <w:r>
-        <w:rPr>
-          <w:rFonts w:hint="eastAsia"/>
-        </w:rPr>
-        <w:t>mthMatchTreeRuntime</w:t>
-      </w:r>
-      <w:r>
-        <w:rPr>
-          <w:rFonts w:hint="eastAsia"/>
-        </w:rPr>
-        <w:t>中，不存储在缓存中，由实际运行时生成</w:t>
-      </w:r>
-    </w:p>
-    <w:p>
-      <w:pPr>
-        <w:pStyle w:val="ListParagraph"/>
-        <w:numPr>
-          <w:ilvl w:val="0"/>
-          <w:numId w:val="36"/>
-        </w:numPr>
-        <w:ind w:firstLineChars="0"/>
-      </w:pPr>
-      <w:r>
-        <w:rPr>
-          <w:rFonts w:hint="eastAsia"/>
-        </w:rPr>
-        <w:t>索引使用信息也可以确定，因此</w:t>
-      </w:r>
-      <w:r>
-        <w:rPr>
-          <w:rFonts w:hint="eastAsia"/>
-        </w:rPr>
-        <w:t>optScanPath</w:t>
-      </w:r>
-      <w:r>
-        <w:rPr>
-          <w:rFonts w:hint="eastAsia"/>
-        </w:rPr>
-        <w:t>也存储在</w:t>
-      </w:r>
-      <w:r>
-        <w:rPr>
-          <w:rFonts w:hint="eastAsia"/>
-        </w:rPr>
-        <w:t>optParamAccessPlan</w:t>
-      </w:r>
-      <w:r>
-        <w:rPr>
-          <w:rFonts w:hint="eastAsia"/>
-        </w:rPr>
-        <w:t>中</w:t>
-      </w:r>
-    </w:p>
-    <w:p>
-      <w:r>
-        <w:rPr>
-          <w:rFonts w:hint="eastAsia"/>
-          <w:noProof/>
-        </w:rPr>
-        <w:drawing>
-          <wp:inline distT="0" distB="0" distL="0" distR="0">
-            <wp:extent cx="5274310" cy="2971345"/>
-            <wp:effectExtent l="19050" t="0" r="2540" b="0"/>
-            <wp:docPr id="29" name="Picture 13"/>
-            <wp:cNvGraphicFramePr>
-              <a:graphicFrameLocks xmlns:a="http://schemas.openxmlformats.org/drawingml/2006/main" noChangeAspect="1"/>
-            </wp:cNvGraphicFramePr>
-            <a:graphic xmlns:a="http://schemas.openxmlformats.org/drawingml/2006/main">
-              <a:graphicData uri="http://schemas.openxmlformats.org/drawingml/2006/picture">
-                <pic:pic xmlns:pic="http://schemas.openxmlformats.org/drawingml/2006/picture">
-                  <pic:nvPicPr>
-                    <pic:cNvPr id="0" name="Picture 13"/>
                     <pic:cNvPicPr>
                       <a:picLocks noChangeAspect="1" noChangeArrowheads="1"/>
                     </pic:cNvPicPr>
@@ -11763,6 +12296,219 @@
         </w:drawing>
       </w:r>
     </w:p>
+    <w:p/>
+    <w:p>
+      <w:pPr>
+        <w:pStyle w:val="Heading4"/>
+      </w:pPr>
+      <w:r>
+        <w:rPr>
+          <w:rFonts w:hint="eastAsia"/>
+        </w:rPr>
+        <w:t>OPT_PLAN_PARAMETERIZED</w:t>
+      </w:r>
+    </w:p>
+    <w:p>
+      <w:pPr>
+        <w:pStyle w:val="ListParagraph"/>
+        <w:numPr>
+          <w:ilvl w:val="0"/>
+          <w:numId w:val="36"/>
+        </w:numPr>
+        <w:ind w:firstLineChars="0"/>
+      </w:pPr>
+      <w:r>
+        <w:rPr>
+          <w:rFonts w:hint="eastAsia"/>
+        </w:rPr>
+        <w:t>mthMatchTree</w:t>
+      </w:r>
+      <w:r>
+        <w:rPr>
+          <w:rFonts w:hint="eastAsia"/>
+        </w:rPr>
+        <w:t>可以确定，因此挂在</w:t>
+      </w:r>
+      <w:r>
+        <w:rPr>
+          <w:rFonts w:hint="eastAsia"/>
+        </w:rPr>
+        <w:t>optParamAccessPlan</w:t>
+      </w:r>
+      <w:r>
+        <w:rPr>
+          <w:rFonts w:hint="eastAsia"/>
+        </w:rPr>
+        <w:t>中，并存储在缓存中</w:t>
+      </w:r>
+    </w:p>
+    <w:p>
+      <w:pPr>
+        <w:pStyle w:val="ListParagraph"/>
+        <w:numPr>
+          <w:ilvl w:val="1"/>
+          <w:numId w:val="36"/>
+        </w:numPr>
+        <w:ind w:firstLineChars="0"/>
+      </w:pPr>
+      <w:r>
+        <w:rPr>
+          <w:rFonts w:hint="eastAsia"/>
+        </w:rPr>
+        <w:t>mthMatchTreeRuntime</w:t>
+      </w:r>
+      <w:r>
+        <w:rPr>
+          <w:rFonts w:hint="eastAsia"/>
+        </w:rPr>
+        <w:t>中通过指针引用</w:t>
+      </w:r>
+    </w:p>
+    <w:p>
+      <w:pPr>
+        <w:pStyle w:val="ListParagraph"/>
+        <w:numPr>
+          <w:ilvl w:val="0"/>
+          <w:numId w:val="36"/>
+        </w:numPr>
+        <w:ind w:firstLineChars="0"/>
+      </w:pPr>
+      <w:r>
+        <w:rPr>
+          <w:rFonts w:hint="eastAsia"/>
+        </w:rPr>
+        <w:t>因为参数化，所以</w:t>
+      </w:r>
+      <w:r>
+        <w:rPr>
+          <w:rFonts w:hint="eastAsia"/>
+        </w:rPr>
+        <w:t>predicates</w:t>
+      </w:r>
+      <w:r>
+        <w:rPr>
+          <w:rFonts w:hint="eastAsia"/>
+        </w:rPr>
+        <w:t>不可以确定，所以挂在</w:t>
+      </w:r>
+      <w:r>
+        <w:rPr>
+          <w:rFonts w:hint="eastAsia"/>
+        </w:rPr>
+        <w:t>optAccessPlanRuntime</w:t>
+      </w:r>
+      <w:r>
+        <w:rPr>
+          <w:rFonts w:hint="eastAsia"/>
+        </w:rPr>
+        <w:t>的</w:t>
+      </w:r>
+      <w:r>
+        <w:rPr>
+          <w:rFonts w:hint="eastAsia"/>
+        </w:rPr>
+        <w:t>mthMatchTreeRuntime</w:t>
+      </w:r>
+      <w:r>
+        <w:rPr>
+          <w:rFonts w:hint="eastAsia"/>
+        </w:rPr>
+        <w:t>中，不存储在缓存中，由实际运行时生成</w:t>
+      </w:r>
+    </w:p>
+    <w:p>
+      <w:pPr>
+        <w:pStyle w:val="ListParagraph"/>
+        <w:numPr>
+          <w:ilvl w:val="0"/>
+          <w:numId w:val="36"/>
+        </w:numPr>
+        <w:ind w:firstLineChars="0"/>
+      </w:pPr>
+      <w:r>
+        <w:rPr>
+          <w:rFonts w:hint="eastAsia"/>
+        </w:rPr>
+        <w:t>索引使用信息也可以确定，因此</w:t>
+      </w:r>
+      <w:r>
+        <w:rPr>
+          <w:rFonts w:hint="eastAsia"/>
+        </w:rPr>
+        <w:t>optScanPath</w:t>
+      </w:r>
+      <w:r>
+        <w:rPr>
+          <w:rFonts w:hint="eastAsia"/>
+        </w:rPr>
+        <w:t>也存储在</w:t>
+      </w:r>
+      <w:r>
+        <w:rPr>
+          <w:rFonts w:hint="eastAsia"/>
+        </w:rPr>
+        <w:t>optParamAccessPlan</w:t>
+      </w:r>
+      <w:r>
+        <w:rPr>
+          <w:rFonts w:hint="eastAsia"/>
+        </w:rPr>
+        <w:t>中</w:t>
+      </w:r>
+    </w:p>
+    <w:p>
+      <w:r>
+        <w:rPr>
+          <w:rFonts w:hint="eastAsia"/>
+          <w:noProof/>
+        </w:rPr>
+        <w:drawing>
+          <wp:inline distT="0" distB="0" distL="0" distR="0">
+            <wp:extent cx="5274310" cy="2971345"/>
+            <wp:effectExtent l="19050" t="0" r="2540" b="0"/>
+            <wp:docPr id="29" name="Picture 13"/>
+            <wp:cNvGraphicFramePr>
+              <a:graphicFrameLocks xmlns:a="http://schemas.openxmlformats.org/drawingml/2006/main" noChangeAspect="1"/>
+            </wp:cNvGraphicFramePr>
+            <a:graphic xmlns:a="http://schemas.openxmlformats.org/drawingml/2006/main">
+              <a:graphicData uri="http://schemas.openxmlformats.org/drawingml/2006/picture">
+                <pic:pic xmlns:pic="http://schemas.openxmlformats.org/drawingml/2006/picture">
+                  <pic:nvPicPr>
+                    <pic:cNvPr id="0" name="Picture 13"/>
+                    <pic:cNvPicPr>
+                      <a:picLocks noChangeAspect="1" noChangeArrowheads="1"/>
+                    </pic:cNvPicPr>
+                  </pic:nvPicPr>
+                  <pic:blipFill>
+                    <a:blip r:embed="rId16"/>
+                    <a:srcRect/>
+                    <a:stretch>
+                      <a:fillRect/>
+                    </a:stretch>
+                  </pic:blipFill>
+                  <pic:spPr bwMode="auto">
+                    <a:xfrm>
+                      <a:off x="0" y="0"/>
+                      <a:ext cx="5274310" cy="2971345"/>
+                    </a:xfrm>
+                    <a:prstGeom prst="rect">
+                      <a:avLst/>
+                    </a:prstGeom>
+                    <a:noFill/>
+                    <a:ln w="9525">
+                      <a:noFill/>
+                      <a:miter lim="800000"/>
+                      <a:headEnd/>
+                      <a:tailEnd/>
+                    </a:ln>
+                  </pic:spPr>
+                </pic:pic>
+              </a:graphicData>
+            </a:graphic>
+          </wp:inline>
+        </w:drawing>
+      </w:r>
+    </w:p>
     <w:p>
       <w:pPr>
         <w:pStyle w:val="Heading4"/>
@@ -11968,7 +12714,7 @@
                     </pic:cNvPicPr>
                   </pic:nvPicPr>
                   <pic:blipFill>
-                    <a:blip r:embed="rId16"/>
+                    <a:blip r:embed="rId17"/>
                     <a:srcRect/>
                     <a:stretch>
                       <a:fillRect/>
@@ -12044,7 +12790,7 @@
                     </pic:cNvPicPr>
                   </pic:nvPicPr>
                   <pic:blipFill>
-                    <a:blip r:embed="rId17"/>
+                    <a:blip r:embed="rId18"/>
                     <a:srcRect/>
                     <a:stretch>
                       <a:fillRect/>
@@ -13311,7 +14057,7 @@
                     </pic:cNvPicPr>
                   </pic:nvPicPr>
                   <pic:blipFill>
-                    <a:blip r:embed="rId18"/>
+                    <a:blip r:embed="rId19"/>
                     <a:srcRect/>
                     <a:stretch>
                       <a:fillRect/>
@@ -15572,7 +16318,7 @@
             <wp:cNvGraphicFramePr/>
             <a:graphic xmlns:a="http://schemas.openxmlformats.org/drawingml/2006/main">
               <a:graphicData uri="http://schemas.openxmlformats.org/drawingml/2006/chart">
-                <c:chart xmlns:c="http://schemas.openxmlformats.org/drawingml/2006/chart" xmlns:r="http://schemas.openxmlformats.org/officeDocument/2006/relationships" r:id="rId19"/>
+                <c:chart xmlns:c="http://schemas.openxmlformats.org/drawingml/2006/chart" xmlns:r="http://schemas.openxmlformats.org/officeDocument/2006/relationships" r:id="rId20"/>
               </a:graphicData>
             </a:graphic>
           </wp:inline>
@@ -17108,7 +17854,7 @@
             <wp:cNvGraphicFramePr/>
             <a:graphic xmlns:a="http://schemas.openxmlformats.org/drawingml/2006/main">
               <a:graphicData uri="http://schemas.openxmlformats.org/drawingml/2006/chart">
-                <c:chart xmlns:c="http://schemas.openxmlformats.org/drawingml/2006/chart" xmlns:r="http://schemas.openxmlformats.org/officeDocument/2006/relationships" r:id="rId20"/>
+                <c:chart xmlns:c="http://schemas.openxmlformats.org/drawingml/2006/chart" xmlns:r="http://schemas.openxmlformats.org/officeDocument/2006/relationships" r:id="rId21"/>
               </a:graphicData>
             </a:graphic>
           </wp:inline>
@@ -18679,7 +19425,7 @@
             <wp:cNvGraphicFramePr/>
             <a:graphic xmlns:a="http://schemas.openxmlformats.org/drawingml/2006/main">
               <a:graphicData uri="http://schemas.openxmlformats.org/drawingml/2006/chart">
-                <c:chart xmlns:c="http://schemas.openxmlformats.org/drawingml/2006/chart" xmlns:r="http://schemas.openxmlformats.org/officeDocument/2006/relationships" r:id="rId21"/>
+                <c:chart xmlns:c="http://schemas.openxmlformats.org/drawingml/2006/chart" xmlns:r="http://schemas.openxmlformats.org/officeDocument/2006/relationships" r:id="rId22"/>
               </a:graphicData>
             </a:graphic>
           </wp:inline>
@@ -21377,7 +22123,7 @@
             <wp:cNvGraphicFramePr/>
             <a:graphic xmlns:a="http://schemas.openxmlformats.org/drawingml/2006/main">
               <a:graphicData uri="http://schemas.openxmlformats.org/drawingml/2006/chart">
-                <c:chart xmlns:c="http://schemas.openxmlformats.org/drawingml/2006/chart" xmlns:r="http://schemas.openxmlformats.org/officeDocument/2006/relationships" r:id="rId22"/>
+                <c:chart xmlns:c="http://schemas.openxmlformats.org/drawingml/2006/chart" xmlns:r="http://schemas.openxmlformats.org/officeDocument/2006/relationships" r:id="rId23"/>
               </a:graphicData>
             </a:graphic>
           </wp:inline>
@@ -23257,7 +24003,7 @@
             <wp:cNvGraphicFramePr/>
             <a:graphic xmlns:a="http://schemas.openxmlformats.org/drawingml/2006/main">
               <a:graphicData uri="http://schemas.openxmlformats.org/drawingml/2006/chart">
-                <c:chart xmlns:c="http://schemas.openxmlformats.org/drawingml/2006/chart" xmlns:r="http://schemas.openxmlformats.org/officeDocument/2006/relationships" r:id="rId23"/>
+                <c:chart xmlns:c="http://schemas.openxmlformats.org/drawingml/2006/chart" xmlns:r="http://schemas.openxmlformats.org/officeDocument/2006/relationships" r:id="rId24"/>
               </a:graphicData>
             </a:graphic>
           </wp:inline>
@@ -25246,6 +25992,62 @@
 </w:document>
 </file>
 
+<file path=word/comments.xml><?xml version="1.0" encoding="utf-8"?>
+<w:comments xmlns:ve="http://schemas.openxmlformats.org/markup-compatibility/2006" xmlns:o="urn:schemas-microsoft-com:office:office" xmlns:r="http://schemas.openxmlformats.org/officeDocument/2006/relationships" xmlns:m="http://schemas.openxmlformats.org/officeDocument/2006/math" xmlns:v="urn:schemas-microsoft-com:vml" xmlns:wp="http://schemas.openxmlformats.org/drawingml/2006/wordprocessingDrawing" xmlns:w10="urn:schemas-microsoft-com:office:word" xmlns:w="http://schemas.openxmlformats.org/wordprocessingml/2006/main" xmlns:wne="http://schemas.microsoft.com/office/word/2006/wordml">
+  <w:comment w:id="0" w:author="heguoming" w:date="2019-05-28T11:01:00Z" w:initials="hegm">
+    <w:p>
+      <w:pPr>
+        <w:pStyle w:val="CommentText"/>
+        <w:rPr>
+          <w:rFonts w:hint="eastAsia"/>
+        </w:rPr>
+      </w:pPr>
+      <w:r>
+        <w:rPr>
+          <w:rStyle w:val="CommentReference"/>
+        </w:rPr>
+        <w:annotationRef/>
+      </w:r>
+      <w:r>
+        <w:rPr>
+          <w:rFonts w:hint="eastAsia"/>
+        </w:rPr>
+        <w:t>获取查询计划时</w:t>
+      </w:r>
+      <w:r>
+        <w:rPr>
+          <w:rFonts w:hint="eastAsia"/>
+        </w:rPr>
+        <w:t xml:space="preserve"> mbContext </w:t>
+      </w:r>
+      <w:r>
+        <w:rPr>
+          <w:rFonts w:hint="eastAsia"/>
+        </w:rPr>
+        <w:t>并未加锁，此处取统计信息疑有问题</w:t>
+      </w:r>
+    </w:p>
+    <w:p>
+      <w:pPr>
+        <w:pStyle w:val="CommentText"/>
+      </w:pPr>
+      <w:r>
+        <w:rPr>
+          <w:rFonts w:hint="eastAsia"/>
+        </w:rPr>
+        <w:t>延后一次处理？</w:t>
+      </w:r>
+      <w:r>
+        <w:rPr>
+          <w:rFonts w:hint="eastAsia"/>
+        </w:rPr>
+        <w:t>生成一份无锁缓存？</w:t>
+      </w:r>
+    </w:p>
+  </w:comment>
+</w:comments>
+</file>
+
 <file path=word/endnotes.xml><?xml version="1.0" encoding="utf-8"?>
 <w:endnotes xmlns:ve="http://schemas.openxmlformats.org/markup-compatibility/2006" xmlns:o="urn:schemas-microsoft-com:office:office" xmlns:r="http://schemas.openxmlformats.org/officeDocument/2006/relationships" xmlns:m="http://schemas.openxmlformats.org/officeDocument/2006/math" xmlns:v="urn:schemas-microsoft-com:vml" xmlns:wp="http://schemas.openxmlformats.org/drawingml/2006/wordprocessingDrawing" xmlns:w10="urn:schemas-microsoft-com:office:word" xmlns:w="http://schemas.openxmlformats.org/wordprocessingml/2006/main" xmlns:wne="http://schemas.microsoft.com/office/word/2006/wordml">
   <w:endnote w:type="separator" w:id="0">
@@ -26673,6 +27475,92 @@
     </w:lvl>
   </w:abstractNum>
   <w:abstractNum w:abstractNumId="16">
+    <w:nsid w:val="26250896"/>
+    <w:multiLevelType w:val="hybridMultilevel"/>
+    <w:tmpl w:val="08D05242"/>
+    <w:lvl w:ilvl="0" w:tplc="0409000F">
+      <w:start w:val="1"/>
+      <w:numFmt w:val="decimal"/>
+      <w:lvlText w:val="%1."/>
+      <w:lvlJc w:val="left"/>
+      <w:pPr>
+        <w:ind w:left="777" w:hanging="420"/>
+      </w:pPr>
+    </w:lvl>
+    <w:lvl w:ilvl="1" w:tplc="0409000F">
+      <w:start w:val="1"/>
+      <w:numFmt w:val="decimal"/>
+      <w:lvlText w:val="%2."/>
+      <w:lvlJc w:val="left"/>
+      <w:pPr>
+        <w:ind w:left="1197" w:hanging="420"/>
+      </w:pPr>
+    </w:lvl>
+    <w:lvl w:ilvl="2" w:tplc="0409000F">
+      <w:start w:val="1"/>
+      <w:numFmt w:val="decimal"/>
+      <w:lvlText w:val="%3."/>
+      <w:lvlJc w:val="left"/>
+      <w:pPr>
+        <w:ind w:left="1617" w:hanging="420"/>
+      </w:pPr>
+    </w:lvl>
+    <w:lvl w:ilvl="3" w:tplc="0409000F">
+      <w:start w:val="1"/>
+      <w:numFmt w:val="decimal"/>
+      <w:lvlText w:val="%4."/>
+      <w:lvlJc w:val="left"/>
+      <w:pPr>
+        <w:ind w:left="2037" w:hanging="420"/>
+      </w:pPr>
+    </w:lvl>
+    <w:lvl w:ilvl="4" w:tplc="04090019" w:tentative="1">
+      <w:start w:val="1"/>
+      <w:numFmt w:val="lowerLetter"/>
+      <w:lvlText w:val="%5)"/>
+      <w:lvlJc w:val="left"/>
+      <w:pPr>
+        <w:ind w:left="2457" w:hanging="420"/>
+      </w:pPr>
+    </w:lvl>
+    <w:lvl w:ilvl="5" w:tplc="0409001B" w:tentative="1">
+      <w:start w:val="1"/>
+      <w:numFmt w:val="lowerRoman"/>
+      <w:lvlText w:val="%6."/>
+      <w:lvlJc w:val="right"/>
+      <w:pPr>
+        <w:ind w:left="2877" w:hanging="420"/>
+      </w:pPr>
+    </w:lvl>
+    <w:lvl w:ilvl="6" w:tplc="0409000F" w:tentative="1">
+      <w:start w:val="1"/>
+      <w:numFmt w:val="decimal"/>
+      <w:lvlText w:val="%7."/>
+      <w:lvlJc w:val="left"/>
+      <w:pPr>
+        <w:ind w:left="3297" w:hanging="420"/>
+      </w:pPr>
+    </w:lvl>
+    <w:lvl w:ilvl="7" w:tplc="04090019" w:tentative="1">
+      <w:start w:val="1"/>
+      <w:numFmt w:val="lowerLetter"/>
+      <w:lvlText w:val="%8)"/>
+      <w:lvlJc w:val="left"/>
+      <w:pPr>
+        <w:ind w:left="3717" w:hanging="420"/>
+      </w:pPr>
+    </w:lvl>
+    <w:lvl w:ilvl="8" w:tplc="0409001B" w:tentative="1">
+      <w:start w:val="1"/>
+      <w:numFmt w:val="lowerRoman"/>
+      <w:lvlText w:val="%9."/>
+      <w:lvlJc w:val="right"/>
+      <w:pPr>
+        <w:ind w:left="4137" w:hanging="420"/>
+      </w:pPr>
+    </w:lvl>
+  </w:abstractNum>
+  <w:abstractNum w:abstractNumId="17">
     <w:nsid w:val="29211EAF"/>
     <w:multiLevelType w:val="hybridMultilevel"/>
     <w:tmpl w:val="47A61A22"/>
@@ -26758,7 +27646,7 @@
       </w:pPr>
     </w:lvl>
   </w:abstractNum>
-  <w:abstractNum w:abstractNumId="17">
+  <w:abstractNum w:abstractNumId="18">
     <w:nsid w:val="29B77B9A"/>
     <w:multiLevelType w:val="hybridMultilevel"/>
     <w:tmpl w:val="235861F4"/>
@@ -26844,7 +27732,7 @@
       </w:pPr>
     </w:lvl>
   </w:abstractNum>
-  <w:abstractNum w:abstractNumId="18">
+  <w:abstractNum w:abstractNumId="19">
     <w:nsid w:val="2F690CA2"/>
     <w:multiLevelType w:val="hybridMultilevel"/>
     <w:tmpl w:val="6DEED186"/>
@@ -26930,7 +27818,7 @@
       </w:pPr>
     </w:lvl>
   </w:abstractNum>
-  <w:abstractNum w:abstractNumId="19">
+  <w:abstractNum w:abstractNumId="20">
     <w:nsid w:val="39F94B21"/>
     <w:multiLevelType w:val="hybridMultilevel"/>
     <w:tmpl w:val="F0EAD942"/>
@@ -27016,7 +27904,7 @@
       </w:pPr>
     </w:lvl>
   </w:abstractNum>
-  <w:abstractNum w:abstractNumId="20">
+  <w:abstractNum w:abstractNumId="21">
     <w:nsid w:val="3FFC5661"/>
     <w:multiLevelType w:val="hybridMultilevel"/>
     <w:tmpl w:val="C52A9966"/>
@@ -27102,7 +27990,7 @@
       </w:pPr>
     </w:lvl>
   </w:abstractNum>
-  <w:abstractNum w:abstractNumId="21">
+  <w:abstractNum w:abstractNumId="22">
     <w:nsid w:val="40303BF3"/>
     <w:multiLevelType w:val="hybridMultilevel"/>
     <w:tmpl w:val="542C8574"/>
@@ -27188,7 +28076,7 @@
       </w:pPr>
     </w:lvl>
   </w:abstractNum>
-  <w:abstractNum w:abstractNumId="22">
+  <w:abstractNum w:abstractNumId="23">
     <w:nsid w:val="430429AC"/>
     <w:multiLevelType w:val="hybridMultilevel"/>
     <w:tmpl w:val="EC647346"/>
@@ -27274,7 +28162,7 @@
       </w:pPr>
     </w:lvl>
   </w:abstractNum>
-  <w:abstractNum w:abstractNumId="23">
+  <w:abstractNum w:abstractNumId="24">
     <w:nsid w:val="470851C2"/>
     <w:multiLevelType w:val="hybridMultilevel"/>
     <w:tmpl w:val="9BD0E888"/>
@@ -27360,7 +28248,7 @@
       </w:pPr>
     </w:lvl>
   </w:abstractNum>
-  <w:abstractNum w:abstractNumId="24">
+  <w:abstractNum w:abstractNumId="25">
     <w:nsid w:val="4820363A"/>
     <w:multiLevelType w:val="hybridMultilevel"/>
     <w:tmpl w:val="6C289F96"/>
@@ -27446,7 +28334,7 @@
       </w:pPr>
     </w:lvl>
   </w:abstractNum>
-  <w:abstractNum w:abstractNumId="25">
+  <w:abstractNum w:abstractNumId="26">
     <w:nsid w:val="4A056139"/>
     <w:multiLevelType w:val="hybridMultilevel"/>
     <w:tmpl w:val="542C8574"/>
@@ -27532,7 +28420,7 @@
       </w:pPr>
     </w:lvl>
   </w:abstractNum>
-  <w:abstractNum w:abstractNumId="26">
+  <w:abstractNum w:abstractNumId="27">
     <w:nsid w:val="4B0670DF"/>
     <w:multiLevelType w:val="hybridMultilevel"/>
     <w:tmpl w:val="FFEA8316"/>
@@ -27618,7 +28506,7 @@
       </w:pPr>
     </w:lvl>
   </w:abstractNum>
-  <w:abstractNum w:abstractNumId="27">
+  <w:abstractNum w:abstractNumId="28">
     <w:nsid w:val="506E6442"/>
     <w:multiLevelType w:val="hybridMultilevel"/>
     <w:tmpl w:val="338C01A6"/>
@@ -27704,7 +28592,7 @@
       </w:pPr>
     </w:lvl>
   </w:abstractNum>
-  <w:abstractNum w:abstractNumId="28">
+  <w:abstractNum w:abstractNumId="29">
     <w:nsid w:val="563D1912"/>
     <w:multiLevelType w:val="hybridMultilevel"/>
     <w:tmpl w:val="62BC5BA2"/>
@@ -27790,7 +28678,7 @@
       </w:pPr>
     </w:lvl>
   </w:abstractNum>
-  <w:abstractNum w:abstractNumId="29">
+  <w:abstractNum w:abstractNumId="30">
     <w:nsid w:val="5765029B"/>
     <w:multiLevelType w:val="hybridMultilevel"/>
     <w:tmpl w:val="31B6A236"/>
@@ -27876,7 +28764,7 @@
       </w:pPr>
     </w:lvl>
   </w:abstractNum>
-  <w:abstractNum w:abstractNumId="30">
+  <w:abstractNum w:abstractNumId="31">
     <w:nsid w:val="589E00D2"/>
     <w:multiLevelType w:val="hybridMultilevel"/>
     <w:tmpl w:val="F1EE0268"/>
@@ -27963,7 +28851,7 @@
       </w:pPr>
     </w:lvl>
   </w:abstractNum>
-  <w:abstractNum w:abstractNumId="31">
+  <w:abstractNum w:abstractNumId="32">
     <w:nsid w:val="5B71554B"/>
     <w:multiLevelType w:val="hybridMultilevel"/>
     <w:tmpl w:val="FC701336"/>
@@ -28049,7 +28937,7 @@
       </w:pPr>
     </w:lvl>
   </w:abstractNum>
-  <w:abstractNum w:abstractNumId="32">
+  <w:abstractNum w:abstractNumId="33">
     <w:nsid w:val="5D1D7060"/>
     <w:multiLevelType w:val="hybridMultilevel"/>
     <w:tmpl w:val="542C8574"/>
@@ -28135,7 +29023,7 @@
       </w:pPr>
     </w:lvl>
   </w:abstractNum>
-  <w:abstractNum w:abstractNumId="33">
+  <w:abstractNum w:abstractNumId="34">
     <w:nsid w:val="6250520F"/>
     <w:multiLevelType w:val="hybridMultilevel"/>
     <w:tmpl w:val="723E4382"/>
@@ -28221,7 +29109,7 @@
       </w:pPr>
     </w:lvl>
   </w:abstractNum>
-  <w:abstractNum w:abstractNumId="34">
+  <w:abstractNum w:abstractNumId="35">
     <w:nsid w:val="653C0A41"/>
     <w:multiLevelType w:val="hybridMultilevel"/>
     <w:tmpl w:val="3484237A"/>
@@ -28307,7 +29195,7 @@
       </w:pPr>
     </w:lvl>
   </w:abstractNum>
-  <w:abstractNum w:abstractNumId="35">
+  <w:abstractNum w:abstractNumId="36">
     <w:nsid w:val="69535C3A"/>
     <w:multiLevelType w:val="hybridMultilevel"/>
     <w:tmpl w:val="542C8574"/>
@@ -28393,7 +29281,93 @@
       </w:pPr>
     </w:lvl>
   </w:abstractNum>
-  <w:abstractNum w:abstractNumId="36">
+  <w:abstractNum w:abstractNumId="37">
+    <w:nsid w:val="6F8D3D30"/>
+    <w:multiLevelType w:val="hybridMultilevel"/>
+    <w:tmpl w:val="08D05242"/>
+    <w:lvl w:ilvl="0" w:tplc="0409000F">
+      <w:start w:val="1"/>
+      <w:numFmt w:val="decimal"/>
+      <w:lvlText w:val="%1."/>
+      <w:lvlJc w:val="left"/>
+      <w:pPr>
+        <w:ind w:left="777" w:hanging="420"/>
+      </w:pPr>
+    </w:lvl>
+    <w:lvl w:ilvl="1" w:tplc="0409000F">
+      <w:start w:val="1"/>
+      <w:numFmt w:val="decimal"/>
+      <w:lvlText w:val="%2."/>
+      <w:lvlJc w:val="left"/>
+      <w:pPr>
+        <w:ind w:left="1197" w:hanging="420"/>
+      </w:pPr>
+    </w:lvl>
+    <w:lvl w:ilvl="2" w:tplc="0409000F">
+      <w:start w:val="1"/>
+      <w:numFmt w:val="decimal"/>
+      <w:lvlText w:val="%3."/>
+      <w:lvlJc w:val="left"/>
+      <w:pPr>
+        <w:ind w:left="1617" w:hanging="420"/>
+      </w:pPr>
+    </w:lvl>
+    <w:lvl w:ilvl="3" w:tplc="0409000F">
+      <w:start w:val="1"/>
+      <w:numFmt w:val="decimal"/>
+      <w:lvlText w:val="%4."/>
+      <w:lvlJc w:val="left"/>
+      <w:pPr>
+        <w:ind w:left="2037" w:hanging="420"/>
+      </w:pPr>
+    </w:lvl>
+    <w:lvl w:ilvl="4" w:tplc="04090019" w:tentative="1">
+      <w:start w:val="1"/>
+      <w:numFmt w:val="lowerLetter"/>
+      <w:lvlText w:val="%5)"/>
+      <w:lvlJc w:val="left"/>
+      <w:pPr>
+        <w:ind w:left="2457" w:hanging="420"/>
+      </w:pPr>
+    </w:lvl>
+    <w:lvl w:ilvl="5" w:tplc="0409001B" w:tentative="1">
+      <w:start w:val="1"/>
+      <w:numFmt w:val="lowerRoman"/>
+      <w:lvlText w:val="%6."/>
+      <w:lvlJc w:val="right"/>
+      <w:pPr>
+        <w:ind w:left="2877" w:hanging="420"/>
+      </w:pPr>
+    </w:lvl>
+    <w:lvl w:ilvl="6" w:tplc="0409000F" w:tentative="1">
+      <w:start w:val="1"/>
+      <w:numFmt w:val="decimal"/>
+      <w:lvlText w:val="%7."/>
+      <w:lvlJc w:val="left"/>
+      <w:pPr>
+        <w:ind w:left="3297" w:hanging="420"/>
+      </w:pPr>
+    </w:lvl>
+    <w:lvl w:ilvl="7" w:tplc="04090019" w:tentative="1">
+      <w:start w:val="1"/>
+      <w:numFmt w:val="lowerLetter"/>
+      <w:lvlText w:val="%8)"/>
+      <w:lvlJc w:val="left"/>
+      <w:pPr>
+        <w:ind w:left="3717" w:hanging="420"/>
+      </w:pPr>
+    </w:lvl>
+    <w:lvl w:ilvl="8" w:tplc="0409001B" w:tentative="1">
+      <w:start w:val="1"/>
+      <w:numFmt w:val="lowerRoman"/>
+      <w:lvlText w:val="%9."/>
+      <w:lvlJc w:val="right"/>
+      <w:pPr>
+        <w:ind w:left="4137" w:hanging="420"/>
+      </w:pPr>
+    </w:lvl>
+  </w:abstractNum>
+  <w:abstractNum w:abstractNumId="38">
     <w:nsid w:val="73596A6D"/>
     <w:multiLevelType w:val="hybridMultilevel"/>
     <w:tmpl w:val="542C8574"/>
@@ -28479,7 +29453,7 @@
       </w:pPr>
     </w:lvl>
   </w:abstractNum>
-  <w:abstractNum w:abstractNumId="37">
+  <w:abstractNum w:abstractNumId="39">
     <w:nsid w:val="75DF4032"/>
     <w:multiLevelType w:val="hybridMultilevel"/>
     <w:tmpl w:val="172A2470"/>
@@ -28565,7 +29539,7 @@
       </w:pPr>
     </w:lvl>
   </w:abstractNum>
-  <w:abstractNum w:abstractNumId="38">
+  <w:abstractNum w:abstractNumId="40">
     <w:nsid w:val="78081197"/>
     <w:multiLevelType w:val="hybridMultilevel"/>
     <w:tmpl w:val="42A08576"/>
@@ -28651,7 +29625,7 @@
       </w:pPr>
     </w:lvl>
   </w:abstractNum>
-  <w:abstractNum w:abstractNumId="39">
+  <w:abstractNum w:abstractNumId="41">
     <w:nsid w:val="79A21979"/>
     <w:multiLevelType w:val="hybridMultilevel"/>
     <w:tmpl w:val="542C8574"/>
@@ -28737,7 +29711,7 @@
       </w:pPr>
     </w:lvl>
   </w:abstractNum>
-  <w:abstractNum w:abstractNumId="40">
+  <w:abstractNum w:abstractNumId="42">
     <w:nsid w:val="7DA03056"/>
     <w:multiLevelType w:val="hybridMultilevel"/>
     <w:tmpl w:val="31B6A236"/>
@@ -28823,7 +29797,7 @@
       </w:pPr>
     </w:lvl>
   </w:abstractNum>
-  <w:abstractNum w:abstractNumId="41">
+  <w:abstractNum w:abstractNumId="43">
     <w:nsid w:val="7E6E1322"/>
     <w:multiLevelType w:val="hybridMultilevel"/>
     <w:tmpl w:val="542C8574"/>
@@ -28909,7 +29883,7 @@
       </w:pPr>
     </w:lvl>
   </w:abstractNum>
-  <w:abstractNum w:abstractNumId="42">
+  <w:abstractNum w:abstractNumId="44">
     <w:nsid w:val="7F872A9E"/>
     <w:multiLevelType w:val="hybridMultilevel"/>
     <w:tmpl w:val="7526D4A8"/>
@@ -28995,7 +29969,7 @@
       </w:pPr>
     </w:lvl>
   </w:abstractNum>
-  <w:abstractNum w:abstractNumId="43">
+  <w:abstractNum w:abstractNumId="45">
     <w:nsid w:val="7F9545AD"/>
     <w:multiLevelType w:val="hybridMultilevel"/>
     <w:tmpl w:val="F30A5848"/>
@@ -29085,16 +30059,16 @@
     <w:abstractNumId w:val="13"/>
   </w:num>
   <w:num w:numId="2">
-    <w:abstractNumId w:val="42"/>
+    <w:abstractNumId w:val="44"/>
   </w:num>
   <w:num w:numId="3">
-    <w:abstractNumId w:val="30"/>
+    <w:abstractNumId w:val="31"/>
   </w:num>
   <w:num w:numId="4">
-    <w:abstractNumId w:val="24"/>
+    <w:abstractNumId w:val="25"/>
   </w:num>
   <w:num w:numId="5">
-    <w:abstractNumId w:val="30"/>
+    <w:abstractNumId w:val="31"/>
     <w:lvlOverride w:ilvl="0">
       <w:startOverride w:val="1"/>
     </w:lvlOverride>
@@ -29106,10 +30080,10 @@
     <w:abstractNumId w:val="11"/>
   </w:num>
   <w:num w:numId="8">
-    <w:abstractNumId w:val="28"/>
+    <w:abstractNumId w:val="29"/>
   </w:num>
   <w:num w:numId="9">
-    <w:abstractNumId w:val="30"/>
+    <w:abstractNumId w:val="31"/>
     <w:lvlOverride w:ilvl="0">
       <w:startOverride w:val="1"/>
     </w:lvlOverride>
@@ -29121,25 +30095,25 @@
     <w:abstractNumId w:val="8"/>
   </w:num>
   <w:num w:numId="12">
-    <w:abstractNumId w:val="43"/>
+    <w:abstractNumId w:val="45"/>
   </w:num>
   <w:num w:numId="13">
-    <w:abstractNumId w:val="33"/>
+    <w:abstractNumId w:val="34"/>
   </w:num>
   <w:num w:numId="14">
-    <w:abstractNumId w:val="20"/>
+    <w:abstractNumId w:val="21"/>
   </w:num>
   <w:num w:numId="15">
-    <w:abstractNumId w:val="34"/>
+    <w:abstractNumId w:val="35"/>
   </w:num>
   <w:num w:numId="16">
     <w:abstractNumId w:val="14"/>
   </w:num>
   <w:num w:numId="17">
-    <w:abstractNumId w:val="22"/>
+    <w:abstractNumId w:val="23"/>
   </w:num>
   <w:num w:numId="18">
-    <w:abstractNumId w:val="23"/>
+    <w:abstractNumId w:val="24"/>
   </w:num>
   <w:num w:numId="19">
     <w:abstractNumId w:val="0"/>
@@ -29154,46 +30128,46 @@
     <w:abstractNumId w:val="12"/>
   </w:num>
   <w:num w:numId="23">
-    <w:abstractNumId w:val="30"/>
+    <w:abstractNumId w:val="31"/>
     <w:lvlOverride w:ilvl="0">
       <w:startOverride w:val="1"/>
     </w:lvlOverride>
   </w:num>
   <w:num w:numId="24">
-    <w:abstractNumId w:val="36"/>
+    <w:abstractNumId w:val="38"/>
   </w:num>
   <w:num w:numId="25">
-    <w:abstractNumId w:val="25"/>
+    <w:abstractNumId w:val="26"/>
   </w:num>
   <w:num w:numId="26">
-    <w:abstractNumId w:val="32"/>
+    <w:abstractNumId w:val="33"/>
   </w:num>
   <w:num w:numId="27">
-    <w:abstractNumId w:val="21"/>
+    <w:abstractNumId w:val="22"/>
   </w:num>
   <w:num w:numId="28">
-    <w:abstractNumId w:val="39"/>
+    <w:abstractNumId w:val="41"/>
   </w:num>
   <w:num w:numId="29">
-    <w:abstractNumId w:val="27"/>
+    <w:abstractNumId w:val="28"/>
   </w:num>
   <w:num w:numId="30">
-    <w:abstractNumId w:val="40"/>
+    <w:abstractNumId w:val="42"/>
   </w:num>
   <w:num w:numId="31">
     <w:abstractNumId w:val="7"/>
   </w:num>
   <w:num w:numId="32">
-    <w:abstractNumId w:val="29"/>
+    <w:abstractNumId w:val="30"/>
   </w:num>
   <w:num w:numId="33">
-    <w:abstractNumId w:val="18"/>
+    <w:abstractNumId w:val="19"/>
   </w:num>
   <w:num w:numId="34">
     <w:abstractNumId w:val="10"/>
   </w:num>
   <w:num w:numId="35">
-    <w:abstractNumId w:val="31"/>
+    <w:abstractNumId w:val="32"/>
   </w:num>
   <w:num w:numId="36">
     <w:abstractNumId w:val="1"/>
@@ -29202,34 +30176,40 @@
     <w:abstractNumId w:val="4"/>
   </w:num>
   <w:num w:numId="38">
-    <w:abstractNumId w:val="38"/>
+    <w:abstractNumId w:val="40"/>
   </w:num>
   <w:num w:numId="39">
     <w:abstractNumId w:val="9"/>
   </w:num>
   <w:num w:numId="40">
-    <w:abstractNumId w:val="35"/>
+    <w:abstractNumId w:val="36"/>
   </w:num>
   <w:num w:numId="41">
-    <w:abstractNumId w:val="16"/>
+    <w:abstractNumId w:val="17"/>
   </w:num>
   <w:num w:numId="42">
     <w:abstractNumId w:val="6"/>
   </w:num>
   <w:num w:numId="43">
-    <w:abstractNumId w:val="17"/>
+    <w:abstractNumId w:val="18"/>
   </w:num>
   <w:num w:numId="44">
-    <w:abstractNumId w:val="41"/>
+    <w:abstractNumId w:val="43"/>
   </w:num>
   <w:num w:numId="45">
-    <w:abstractNumId w:val="19"/>
+    <w:abstractNumId w:val="20"/>
   </w:num>
   <w:num w:numId="46">
-    <w:abstractNumId w:val="37"/>
+    <w:abstractNumId w:val="39"/>
   </w:num>
   <w:num w:numId="47">
-    <w:abstractNumId w:val="26"/>
+    <w:abstractNumId w:val="27"/>
+  </w:num>
+  <w:num w:numId="48">
+    <w:abstractNumId w:val="16"/>
+  </w:num>
+  <w:num w:numId="49">
+    <w:abstractNumId w:val="37"/>
   </w:num>
   <w:numIdMacAtCleanup w:val="41"/>
 </w:numbering>
@@ -30420,25 +31400,25 @@
             </c:numRef>
           </c:val>
         </c:ser>
-        <c:axId val="72091136"/>
-        <c:axId val="72092672"/>
+        <c:axId val="292845440"/>
+        <c:axId val="292846976"/>
       </c:barChart>
       <c:catAx>
-        <c:axId val="72091136"/>
+        <c:axId val="292845440"/>
         <c:scaling>
           <c:orientation val="minMax"/>
         </c:scaling>
         <c:axPos val="b"/>
         <c:numFmt formatCode="General" sourceLinked="1"/>
         <c:tickLblPos val="nextTo"/>
-        <c:crossAx val="72092672"/>
+        <c:crossAx val="292846976"/>
         <c:crosses val="autoZero"/>
         <c:auto val="1"/>
         <c:lblAlgn val="ctr"/>
         <c:lblOffset val="100"/>
       </c:catAx>
       <c:valAx>
-        <c:axId val="72092672"/>
+        <c:axId val="292846976"/>
         <c:scaling>
           <c:orientation val="minMax"/>
         </c:scaling>
@@ -30446,7 +31426,7 @@
         <c:majorGridlines/>
         <c:numFmt formatCode="General" sourceLinked="1"/>
         <c:tickLblPos val="nextTo"/>
-        <c:crossAx val="72091136"/>
+        <c:crossAx val="292845440"/>
         <c:crosses val="autoZero"/>
         <c:crossBetween val="between"/>
       </c:valAx>
@@ -30760,25 +31740,25 @@
             </c:numRef>
           </c:val>
         </c:ser>
-        <c:axId val="50955776"/>
-        <c:axId val="50957312"/>
+        <c:axId val="108214144"/>
+        <c:axId val="108215680"/>
       </c:barChart>
       <c:catAx>
-        <c:axId val="50955776"/>
+        <c:axId val="108214144"/>
         <c:scaling>
           <c:orientation val="minMax"/>
         </c:scaling>
         <c:axPos val="b"/>
         <c:numFmt formatCode="General" sourceLinked="1"/>
         <c:tickLblPos val="nextTo"/>
-        <c:crossAx val="50957312"/>
+        <c:crossAx val="108215680"/>
         <c:crosses val="autoZero"/>
         <c:auto val="1"/>
         <c:lblAlgn val="ctr"/>
         <c:lblOffset val="100"/>
       </c:catAx>
       <c:valAx>
-        <c:axId val="50957312"/>
+        <c:axId val="108215680"/>
         <c:scaling>
           <c:orientation val="minMax"/>
         </c:scaling>
@@ -30786,7 +31766,7 @@
         <c:majorGridlines/>
         <c:numFmt formatCode="General" sourceLinked="1"/>
         <c:tickLblPos val="nextTo"/>
-        <c:crossAx val="50955776"/>
+        <c:crossAx val="108214144"/>
         <c:crosses val="autoZero"/>
         <c:crossBetween val="between"/>
       </c:valAx>
@@ -31101,25 +32081,25 @@
             </c:numRef>
           </c:val>
         </c:ser>
-        <c:axId val="81356288"/>
-        <c:axId val="81357824"/>
+        <c:axId val="292992896"/>
+        <c:axId val="292994432"/>
       </c:barChart>
       <c:catAx>
-        <c:axId val="81356288"/>
+        <c:axId val="292992896"/>
         <c:scaling>
           <c:orientation val="minMax"/>
         </c:scaling>
         <c:axPos val="b"/>
         <c:numFmt formatCode="General" sourceLinked="1"/>
         <c:tickLblPos val="nextTo"/>
-        <c:crossAx val="81357824"/>
+        <c:crossAx val="292994432"/>
         <c:crosses val="autoZero"/>
         <c:auto val="1"/>
         <c:lblAlgn val="ctr"/>
         <c:lblOffset val="100"/>
       </c:catAx>
       <c:valAx>
-        <c:axId val="81357824"/>
+        <c:axId val="292994432"/>
         <c:scaling>
           <c:orientation val="minMax"/>
         </c:scaling>
@@ -31127,7 +32107,7 @@
         <c:majorGridlines/>
         <c:numFmt formatCode="General" sourceLinked="1"/>
         <c:tickLblPos val="nextTo"/>
-        <c:crossAx val="81356288"/>
+        <c:crossAx val="292992896"/>
         <c:crosses val="autoZero"/>
         <c:crossBetween val="between"/>
       </c:valAx>
@@ -31406,24 +32386,24 @@
             </c:numRef>
           </c:val>
         </c:ser>
-        <c:axId val="78214656"/>
-        <c:axId val="78216192"/>
+        <c:axId val="292939648"/>
+        <c:axId val="292941184"/>
       </c:barChart>
       <c:catAx>
-        <c:axId val="78214656"/>
+        <c:axId val="292939648"/>
         <c:scaling>
           <c:orientation val="minMax"/>
         </c:scaling>
         <c:axPos val="b"/>
         <c:tickLblPos val="nextTo"/>
-        <c:crossAx val="78216192"/>
+        <c:crossAx val="292941184"/>
         <c:crosses val="autoZero"/>
         <c:auto val="1"/>
         <c:lblAlgn val="ctr"/>
         <c:lblOffset val="100"/>
       </c:catAx>
       <c:valAx>
-        <c:axId val="78216192"/>
+        <c:axId val="292941184"/>
         <c:scaling>
           <c:orientation val="minMax"/>
         </c:scaling>
@@ -31431,7 +32411,7 @@
         <c:majorGridlines/>
         <c:numFmt formatCode="General" sourceLinked="1"/>
         <c:tickLblPos val="nextTo"/>
-        <c:crossAx val="78214656"/>
+        <c:crossAx val="292939648"/>
         <c:crosses val="autoZero"/>
         <c:crossBetween val="between"/>
       </c:valAx>
@@ -31596,7 +32576,7 @@
                   <c:v>19257</c:v>
                 </c:pt>
                 <c:pt idx="1">
-                  <c:v>16757.599999999922</c:v>
+                  <c:v>16757.599999999915</c:v>
                 </c:pt>
                 <c:pt idx="2">
                   <c:v>13230</c:v>
@@ -31705,24 +32685,24 @@
             </c:numRef>
           </c:val>
         </c:ser>
-        <c:axId val="81376768"/>
-        <c:axId val="81378304"/>
+        <c:axId val="109315968"/>
+        <c:axId val="109317504"/>
       </c:barChart>
       <c:catAx>
-        <c:axId val="81376768"/>
+        <c:axId val="109315968"/>
         <c:scaling>
           <c:orientation val="minMax"/>
         </c:scaling>
         <c:axPos val="b"/>
         <c:tickLblPos val="nextTo"/>
-        <c:crossAx val="81378304"/>
+        <c:crossAx val="109317504"/>
         <c:crosses val="autoZero"/>
         <c:auto val="1"/>
         <c:lblAlgn val="ctr"/>
         <c:lblOffset val="100"/>
       </c:catAx>
       <c:valAx>
-        <c:axId val="81378304"/>
+        <c:axId val="109317504"/>
         <c:scaling>
           <c:orientation val="minMax"/>
         </c:scaling>
@@ -31730,7 +32710,7 @@
         <c:majorGridlines/>
         <c:numFmt formatCode="General" sourceLinked="1"/>
         <c:tickLblPos val="nextTo"/>
-        <c:crossAx val="81376768"/>
+        <c:crossAx val="109315968"/>
         <c:crosses val="autoZero"/>
         <c:crossBetween val="between"/>
       </c:valAx>

</xml_diff>